<commit_message>
add department, district, province on templates
</commit_message>
<xml_diff>
--- a/CrediAgil/Templates/CONTRATO - PRENDA AUTO - EMPRESA.docx
+++ b/CrediAgil/Templates/CONTRATO - PRENDA AUTO - EMPRESA.docx
@@ -312,7 +312,383 @@
           <w:sz w:val="16"/>
           <w:szCs w:val="16"/>
         </w:rPr>
-        <w:t xml:space="preserve"> La empresa </w:t>
+        <w:t xml:space="preserve"> </w:t>
+      </w:r>
+      <w:r>
+        <w:rPr>
+          <w:rFonts w:cstheme="minorHAnsi"/>
+          <w:b/>
+          <w:bCs/>
+          <w:color w:val="000000"/>
+          <w:sz w:val="16"/>
+          <w:szCs w:val="16"/>
+        </w:rPr>
+        <w:t>${RAZON_SOCIAL}</w:t>
+      </w:r>
+      <w:r>
+        <w:rPr>
+          <w:rFonts w:cstheme="minorHAnsi"/>
+          <w:color w:val="000000"/>
+          <w:sz w:val="16"/>
+          <w:szCs w:val="16"/>
+        </w:rPr>
+        <w:t xml:space="preserve"> identificada con RUC </w:t>
+      </w:r>
+      <w:r>
+        <w:rPr>
+          <w:rFonts w:cstheme="minorHAnsi"/>
+          <w:b/>
+          <w:bCs/>
+          <w:color w:val="000000"/>
+          <w:sz w:val="16"/>
+          <w:szCs w:val="16"/>
+        </w:rPr>
+        <w:t>${RUC_EMPRESA}</w:t>
+      </w:r>
+      <w:r>
+        <w:rPr>
+          <w:rFonts w:cstheme="minorHAnsi"/>
+          <w:color w:val="000000"/>
+          <w:sz w:val="16"/>
+          <w:szCs w:val="16"/>
+        </w:rPr>
+        <w:t xml:space="preserve">, con </w:t>
+      </w:r>
+      <w:r>
+        <w:rPr>
+          <w:rFonts w:cstheme="minorHAnsi"/>
+          <w:b/>
+          <w:bCs/>
+          <w:color w:val="000000"/>
+          <w:sz w:val="16"/>
+          <w:szCs w:val="16"/>
+        </w:rPr>
+        <w:t>DOMICILIO FISCAL</w:t>
+      </w:r>
+      <w:r>
+        <w:rPr>
+          <w:rFonts w:cstheme="minorHAnsi"/>
+          <w:color w:val="000000"/>
+          <w:sz w:val="16"/>
+          <w:szCs w:val="16"/>
+        </w:rPr>
+        <w:t xml:space="preserve"> en </w:t>
+      </w:r>
+      <w:r>
+        <w:rPr>
+          <w:rFonts w:cstheme="minorHAnsi"/>
+          <w:b/>
+          <w:bCs/>
+          <w:color w:val="000000"/>
+          <w:sz w:val="16"/>
+          <w:szCs w:val="16"/>
+        </w:rPr>
+        <w:t>${DIRECCION_FISCAL}</w:t>
+      </w:r>
+      <w:r>
+        <w:rPr>
+          <w:rFonts w:cstheme="minorHAnsi"/>
+          <w:color w:val="000000"/>
+          <w:sz w:val="16"/>
+          <w:szCs w:val="16"/>
+        </w:rPr>
+        <w:t xml:space="preserve">, debidamente representada por el (la) señor(a) </w:t>
+      </w:r>
+      <w:r>
+        <w:rPr>
+          <w:rFonts w:cstheme="minorHAnsi"/>
+          <w:b/>
+          <w:bCs/>
+          <w:color w:val="000000"/>
+          <w:sz w:val="16"/>
+          <w:szCs w:val="16"/>
+        </w:rPr>
+        <w:t>${REP_LEGAL_EMPRESA}</w:t>
+      </w:r>
+      <w:r>
+        <w:rPr>
+          <w:rFonts w:cstheme="minorHAnsi"/>
+          <w:color w:val="000000"/>
+          <w:sz w:val="16"/>
+          <w:szCs w:val="16"/>
+        </w:rPr>
+        <w:t xml:space="preserve">, identificado con DNI N.º </w:t>
+      </w:r>
+      <w:r>
+        <w:rPr>
+          <w:rFonts w:cstheme="minorHAnsi"/>
+          <w:b/>
+          <w:bCs/>
+          <w:color w:val="000000"/>
+          <w:sz w:val="16"/>
+          <w:szCs w:val="16"/>
+        </w:rPr>
+        <w:t>${DNI_REP_LEGAL}</w:t>
+      </w:r>
+      <w:r>
+        <w:rPr>
+          <w:rFonts w:cstheme="minorHAnsi"/>
+          <w:color w:val="000000"/>
+          <w:sz w:val="16"/>
+          <w:szCs w:val="16"/>
+        </w:rPr>
+        <w:t xml:space="preserve">, con domicilio en </w:t>
+      </w:r>
+      <w:r>
+        <w:rPr>
+          <w:rFonts w:cstheme="minorHAnsi"/>
+          <w:b/>
+          <w:bCs/>
+          <w:color w:val="000000"/>
+          <w:sz w:val="16"/>
+          <w:szCs w:val="16"/>
+        </w:rPr>
+        <w:t>${DIRECCION_REP_LEGAL}</w:t>
+      </w:r>
+      <w:r>
+        <w:rPr>
+          <w:rFonts w:cstheme="minorHAnsi"/>
+          <w:color w:val="000000"/>
+          <w:sz w:val="16"/>
+          <w:szCs w:val="16"/>
+        </w:rPr>
+        <w:t xml:space="preserve">, distrito de </w:t>
+      </w:r>
+      <w:r>
+        <w:rPr>
+          <w:rFonts w:cstheme="minorHAnsi"/>
+          <w:b/>
+          <w:bCs/>
+          <w:color w:val="000000"/>
+          <w:sz w:val="16"/>
+          <w:szCs w:val="16"/>
+        </w:rPr>
+        <w:t>${DISTRITO_REP_LEGAL}</w:t>
+      </w:r>
+      <w:r>
+        <w:rPr>
+          <w:rFonts w:cstheme="minorHAnsi"/>
+          <w:color w:val="000000"/>
+          <w:sz w:val="16"/>
+          <w:szCs w:val="16"/>
+        </w:rPr>
+        <w:t xml:space="preserve">, provincia de </w:t>
+      </w:r>
+      <w:r>
+        <w:rPr>
+          <w:rFonts w:cstheme="minorHAnsi"/>
+          <w:b/>
+          <w:bCs/>
+          <w:color w:val="000000"/>
+          <w:sz w:val="16"/>
+          <w:szCs w:val="16"/>
+        </w:rPr>
+        <w:t>${PROVINCIA_REP_LEGAL}</w:t>
+      </w:r>
+      <w:r>
+        <w:rPr>
+          <w:rFonts w:cstheme="minorHAnsi"/>
+          <w:color w:val="000000"/>
+          <w:sz w:val="16"/>
+          <w:szCs w:val="16"/>
+        </w:rPr>
+        <w:t xml:space="preserve"> y departamento de </w:t>
+      </w:r>
+      <w:r>
+        <w:rPr>
+          <w:rFonts w:cstheme="minorHAnsi"/>
+          <w:b/>
+          <w:bCs/>
+          <w:color w:val="000000"/>
+          <w:sz w:val="16"/>
+          <w:szCs w:val="16"/>
+        </w:rPr>
+        <w:t>${DEPARTAMENTO_REP_LEGAL}</w:t>
+      </w:r>
+      <w:r>
+        <w:rPr>
+          <w:rFonts w:cstheme="minorHAnsi"/>
+          <w:color w:val="000000"/>
+          <w:sz w:val="16"/>
+          <w:szCs w:val="16"/>
+        </w:rPr>
+        <w:t xml:space="preserve">, con poderes inscritos en la </w:t>
+      </w:r>
+      <w:r>
+        <w:rPr>
+          <w:rFonts w:cstheme="minorHAnsi"/>
+          <w:b/>
+          <w:bCs/>
+          <w:color w:val="000000"/>
+          <w:sz w:val="16"/>
+          <w:szCs w:val="16"/>
+        </w:rPr>
+        <w:t>Partida Electrónica N.º ${PARTIDA_EMPRESA}</w:t>
+      </w:r>
+      <w:r>
+        <w:rPr>
+          <w:rFonts w:cstheme="minorHAnsi"/>
+          <w:color w:val="000000"/>
+          <w:sz w:val="16"/>
+          <w:szCs w:val="16"/>
+        </w:rPr>
+        <w:t xml:space="preserve"> de la Zona Registral N.º </w:t>
+      </w:r>
+      <w:r>
+        <w:rPr>
+          <w:rFonts w:cstheme="minorHAnsi"/>
+          <w:b/>
+          <w:bCs/>
+          <w:color w:val="000000"/>
+          <w:sz w:val="16"/>
+          <w:szCs w:val="16"/>
+        </w:rPr>
+        <w:t>${ZONA_REGISTRAL}</w:t>
+      </w:r>
+      <w:r>
+        <w:rPr>
+          <w:rFonts w:cstheme="minorHAnsi"/>
+          <w:color w:val="000000"/>
+          <w:sz w:val="16"/>
+          <w:szCs w:val="16"/>
+        </w:rPr>
+        <w:t xml:space="preserve"> de la oficina de Registros Públicos de </w:t>
+      </w:r>
+      <w:r>
+        <w:rPr>
+          <w:rFonts w:cstheme="minorHAnsi"/>
+          <w:b/>
+          <w:bCs/>
+          <w:color w:val="000000"/>
+          <w:sz w:val="16"/>
+          <w:szCs w:val="16"/>
+        </w:rPr>
+        <w:t>${CIUDAD_REGISTRO}</w:t>
+      </w:r>
+      <w:r>
+        <w:rPr>
+          <w:rFonts w:cstheme="minorHAnsi"/>
+          <w:color w:val="000000"/>
+          <w:sz w:val="16"/>
+          <w:szCs w:val="16"/>
+        </w:rPr>
+        <w:t>.</w:t>
+      </w:r>
+    </w:p>
+    <w:p>
+      <w:pPr>
+        <w:spacing w:before="10" w:after="10" w:line="240" w:lineRule="auto"/>
+        <w:ind w:right="-1085"/>
+        <w:jc w:val="both"/>
+        <w:rPr>
+          <w:rFonts w:cstheme="minorHAnsi"/>
+          <w:color w:val="000000"/>
+          <w:sz w:val="16"/>
+          <w:szCs w:val="16"/>
+        </w:rPr>
+      </w:pPr>
+      <w:r>
+        <w:rPr>
+          <w:rFonts w:cstheme="minorHAnsi"/>
+          <w:color w:val="000000"/>
+          <w:sz w:val="16"/>
+          <w:szCs w:val="16"/>
+        </w:rPr>
+        <w:t>Ambas partes convienen en los términos y condiciones siguientes:</w:t>
+      </w:r>
+    </w:p>
+    <w:p>
+      <w:pPr>
+        <w:spacing w:before="10" w:after="10" w:line="240" w:lineRule="auto"/>
+        <w:ind w:right="-1085"/>
+        <w:jc w:val="both"/>
+        <w:rPr>
+          <w:rFonts w:cstheme="minorHAnsi"/>
+          <w:color w:val="000000"/>
+          <w:sz w:val="16"/>
+          <w:szCs w:val="16"/>
+        </w:rPr>
+      </w:pPr>
+    </w:p>
+    <w:p>
+      <w:pPr>
+        <w:spacing w:before="10" w:after="10" w:line="240" w:lineRule="auto"/>
+        <w:ind w:right="-1085"/>
+        <w:jc w:val="both"/>
+        <w:rPr>
+          <w:rFonts w:cstheme="minorHAnsi"/>
+          <w:b/>
+          <w:bCs/>
+          <w:color w:val="000000"/>
+          <w:sz w:val="16"/>
+          <w:szCs w:val="16"/>
+          <w:u w:val="single"/>
+        </w:rPr>
+      </w:pPr>
+      <w:r>
+        <w:rPr>
+          <w:rFonts w:cstheme="minorHAnsi"/>
+          <w:b/>
+          <w:bCs/>
+          <w:color w:val="000000"/>
+          <w:sz w:val="16"/>
+          <w:szCs w:val="16"/>
+          <w:u w:val="single"/>
+        </w:rPr>
+        <w:t>1.- OBJETO</w:t>
+      </w:r>
+    </w:p>
+    <w:p>
+      <w:pPr>
+        <w:spacing w:before="10" w:after="10" w:line="240" w:lineRule="auto"/>
+        <w:ind w:right="-1085"/>
+        <w:jc w:val="both"/>
+        <w:rPr>
+          <w:rFonts w:cstheme="minorHAnsi"/>
+          <w:color w:val="000000"/>
+          <w:sz w:val="16"/>
+          <w:szCs w:val="16"/>
+        </w:rPr>
+      </w:pPr>
+      <w:r>
+        <w:rPr>
+          <w:rFonts w:cstheme="minorHAnsi"/>
+          <w:b/>
+          <w:bCs/>
+          <w:color w:val="000000"/>
+          <w:sz w:val="16"/>
+          <w:szCs w:val="16"/>
+        </w:rPr>
+        <w:t>CREDIÁGIL</w:t>
+      </w:r>
+      <w:r>
+        <w:rPr>
+          <w:rFonts w:cstheme="minorHAnsi"/>
+          <w:color w:val="000000"/>
+          <w:sz w:val="16"/>
+          <w:szCs w:val="16"/>
+        </w:rPr>
+        <w:t xml:space="preserve"> otorga a </w:t>
+      </w:r>
+      <w:r>
+        <w:rPr>
+          <w:rFonts w:cstheme="minorHAnsi"/>
+          <w:b/>
+          <w:bCs/>
+          <w:color w:val="000000"/>
+          <w:sz w:val="16"/>
+          <w:szCs w:val="16"/>
+        </w:rPr>
+        <w:t>EL CLIENTE</w:t>
+      </w:r>
+      <w:r>
+        <w:rPr>
+          <w:rFonts w:cstheme="minorHAnsi"/>
+          <w:color w:val="000000"/>
+          <w:sz w:val="16"/>
+          <w:szCs w:val="16"/>
+        </w:rPr>
+        <w:t xml:space="preserve"> en calidad de Préstamo la suma de S/ </w:t>
       </w:r>
       <w:r>
         <w:rPr>
@@ -334,7 +710,7 @@
           <w:sz w:val="16"/>
           <w:szCs w:val="16"/>
         </w:rPr>
-        <w:t>RAZON_SOCIAL</w:t>
+        <w:t>MONTO_PRESTAMO</w:t>
       </w:r>
       <w:r>
         <w:rPr>
@@ -354,18 +730,1008 @@
           <w:sz w:val="16"/>
           <w:szCs w:val="16"/>
         </w:rPr>
-        <w:t xml:space="preserve"> con </w:t>
-      </w:r>
-      <w:r>
-        <w:rPr>
-          <w:rFonts w:cstheme="minorHAnsi"/>
-          <w:b/>
-          <w:bCs/>
-          <w:color w:val="000000"/>
-          <w:sz w:val="16"/>
-          <w:szCs w:val="16"/>
-        </w:rPr>
-        <w:t xml:space="preserve">R.U.C. </w:t>
+        <w:t xml:space="preserve"> (</w:t>
+      </w:r>
+      <w:r>
+        <w:rPr>
+          <w:rFonts w:cstheme="minorHAnsi"/>
+          <w:b/>
+          <w:bCs/>
+          <w:color w:val="000000"/>
+          <w:sz w:val="16"/>
+          <w:szCs w:val="16"/>
+        </w:rPr>
+        <w:t>${</w:t>
+      </w:r>
+      <w:r>
+        <w:rPr>
+          <w:rFonts w:cstheme="minorHAnsi"/>
+          <w:b/>
+          <w:bCs/>
+          <w:color w:val="000000"/>
+          <w:sz w:val="16"/>
+          <w:szCs w:val="16"/>
+        </w:rPr>
+        <w:t>LETRAS_PRESTAMO</w:t>
+      </w:r>
+      <w:r>
+        <w:rPr>
+          <w:rFonts w:cstheme="minorHAnsi"/>
+          <w:b/>
+          <w:bCs/>
+          <w:color w:val="000000"/>
+          <w:sz w:val="16"/>
+          <w:szCs w:val="16"/>
+        </w:rPr>
+        <w:t>}</w:t>
+      </w:r>
+      <w:r>
+        <w:rPr>
+          <w:rFonts w:cstheme="minorHAnsi"/>
+          <w:color w:val="000000"/>
+          <w:sz w:val="16"/>
+          <w:szCs w:val="16"/>
+        </w:rPr>
+        <w:t xml:space="preserve"> Y 00/100 SOLES) el mismo que generará los intereses compensatorios, y en caso de incumplimiento las penalidades, así como las comisiones, impuestos y los gastos detallados en la hoja resumen (</w:t>
+      </w:r>
+      <w:r>
+        <w:rPr>
+          <w:rFonts w:cstheme="minorHAnsi"/>
+          <w:b/>
+          <w:bCs/>
+          <w:color w:val="000000"/>
+          <w:sz w:val="16"/>
+          <w:szCs w:val="16"/>
+        </w:rPr>
+        <w:t>ANEXO 02</w:t>
+      </w:r>
+      <w:r>
+        <w:rPr>
+          <w:rFonts w:cstheme="minorHAnsi"/>
+          <w:color w:val="000000"/>
+          <w:sz w:val="16"/>
+          <w:szCs w:val="16"/>
+        </w:rPr>
+        <w:t>), la misma que cuenta con todos los supuestos descritos en el artículo 18 del Reglamento de Transparencia de la Información y Contratación con Usuarios del Sistema Financiero.</w:t>
+      </w:r>
+    </w:p>
+    <w:p>
+      <w:pPr>
+        <w:spacing w:before="10" w:after="10" w:line="240" w:lineRule="auto"/>
+        <w:ind w:right="-1085"/>
+        <w:jc w:val="both"/>
+        <w:rPr>
+          <w:rFonts w:cstheme="minorHAnsi"/>
+          <w:color w:val="000000"/>
+          <w:sz w:val="16"/>
+          <w:szCs w:val="16"/>
+        </w:rPr>
+      </w:pPr>
+    </w:p>
+    <w:p>
+      <w:pPr>
+        <w:spacing w:before="10" w:after="10" w:line="240" w:lineRule="auto"/>
+        <w:ind w:right="-1085"/>
+        <w:jc w:val="both"/>
+        <w:rPr>
+          <w:rFonts w:cstheme="minorHAnsi"/>
+          <w:b/>
+          <w:bCs/>
+          <w:color w:val="000000"/>
+          <w:sz w:val="16"/>
+          <w:szCs w:val="16"/>
+          <w:u w:val="single"/>
+        </w:rPr>
+      </w:pPr>
+      <w:r>
+        <w:rPr>
+          <w:rFonts w:cstheme="minorHAnsi"/>
+          <w:b/>
+          <w:bCs/>
+          <w:color w:val="000000"/>
+          <w:sz w:val="16"/>
+          <w:szCs w:val="16"/>
+          <w:u w:val="single"/>
+        </w:rPr>
+        <w:t>2.- PLAZO Y PAGO DEL PRÉSTAMO</w:t>
+      </w:r>
+    </w:p>
+    <w:p>
+      <w:pPr>
+        <w:spacing w:before="10" w:after="10" w:line="240" w:lineRule="auto"/>
+        <w:ind w:right="-1085"/>
+        <w:jc w:val="both"/>
+        <w:rPr>
+          <w:rFonts w:cstheme="minorHAnsi"/>
+          <w:color w:val="000000"/>
+          <w:sz w:val="16"/>
+          <w:szCs w:val="16"/>
+        </w:rPr>
+      </w:pPr>
+      <w:r>
+        <w:rPr>
+          <w:rFonts w:cstheme="minorHAnsi"/>
+          <w:color w:val="000000"/>
+          <w:sz w:val="16"/>
+          <w:szCs w:val="16"/>
+        </w:rPr>
+        <w:t xml:space="preserve">El plazo que otorga </w:t>
+      </w:r>
+      <w:r>
+        <w:rPr>
+          <w:rFonts w:cstheme="minorHAnsi"/>
+          <w:b/>
+          <w:bCs/>
+          <w:color w:val="000000"/>
+          <w:sz w:val="16"/>
+          <w:szCs w:val="16"/>
+        </w:rPr>
+        <w:t>CREDIÁGIL</w:t>
+      </w:r>
+      <w:r>
+        <w:rPr>
+          <w:rFonts w:cstheme="minorHAnsi"/>
+          <w:color w:val="000000"/>
+          <w:sz w:val="16"/>
+          <w:szCs w:val="16"/>
+        </w:rPr>
+        <w:t xml:space="preserve"> a </w:t>
+      </w:r>
+      <w:r>
+        <w:rPr>
+          <w:rFonts w:cstheme="minorHAnsi"/>
+          <w:b/>
+          <w:bCs/>
+          <w:color w:val="000000"/>
+          <w:sz w:val="16"/>
+          <w:szCs w:val="16"/>
+        </w:rPr>
+        <w:t>EL CLIENTE</w:t>
+      </w:r>
+      <w:r>
+        <w:rPr>
+          <w:rFonts w:cstheme="minorHAnsi"/>
+          <w:color w:val="000000"/>
+          <w:sz w:val="16"/>
+          <w:szCs w:val="16"/>
+        </w:rPr>
+        <w:t xml:space="preserve"> para el pago de su préstamo es de </w:t>
+      </w:r>
+      <w:r>
+        <w:rPr>
+          <w:rFonts w:cstheme="minorHAnsi"/>
+          <w:b/>
+          <w:bCs/>
+          <w:color w:val="000000"/>
+          <w:sz w:val="16"/>
+          <w:szCs w:val="16"/>
+        </w:rPr>
+        <w:t>${</w:t>
+      </w:r>
+      <w:r>
+        <w:rPr>
+          <w:rFonts w:cstheme="minorHAnsi"/>
+          <w:b/>
+          <w:bCs/>
+          <w:color w:val="000000"/>
+          <w:sz w:val="16"/>
+          <w:szCs w:val="16"/>
+        </w:rPr>
+        <w:t>PLAZO_DIAS</w:t>
+      </w:r>
+      <w:r>
+        <w:rPr>
+          <w:rFonts w:cstheme="minorHAnsi"/>
+          <w:b/>
+          <w:bCs/>
+          <w:color w:val="000000"/>
+          <w:sz w:val="16"/>
+          <w:szCs w:val="16"/>
+        </w:rPr>
+        <w:t>}</w:t>
+      </w:r>
+      <w:r>
+        <w:rPr>
+          <w:rFonts w:cstheme="minorHAnsi"/>
+          <w:b/>
+          <w:bCs/>
+          <w:color w:val="000000"/>
+          <w:sz w:val="16"/>
+          <w:szCs w:val="16"/>
+        </w:rPr>
+        <w:t xml:space="preserve"> días calendario</w:t>
+      </w:r>
+      <w:r>
+        <w:rPr>
+          <w:rFonts w:cstheme="minorHAnsi"/>
+          <w:color w:val="000000"/>
+          <w:sz w:val="16"/>
+          <w:szCs w:val="16"/>
+        </w:rPr>
+        <w:t xml:space="preserve">, a cuyo vencimiento </w:t>
+      </w:r>
+      <w:r>
+        <w:rPr>
+          <w:rFonts w:cstheme="minorHAnsi"/>
+          <w:b/>
+          <w:bCs/>
+          <w:color w:val="000000"/>
+          <w:sz w:val="16"/>
+          <w:szCs w:val="16"/>
+        </w:rPr>
+        <w:t>EL CLIENTE</w:t>
+      </w:r>
+      <w:r>
+        <w:rPr>
+          <w:rFonts w:cstheme="minorHAnsi"/>
+          <w:color w:val="000000"/>
+          <w:sz w:val="16"/>
+          <w:szCs w:val="16"/>
+        </w:rPr>
+        <w:t xml:space="preserve"> podrá optar por alguna de las siguientes alternativas:</w:t>
+      </w:r>
+    </w:p>
+    <w:p>
+      <w:pPr>
+        <w:spacing w:before="10" w:after="10" w:line="240" w:lineRule="auto"/>
+        <w:ind w:right="-1085"/>
+        <w:jc w:val="both"/>
+        <w:rPr>
+          <w:rFonts w:cstheme="minorHAnsi"/>
+          <w:b/>
+          <w:bCs/>
+          <w:color w:val="000000"/>
+          <w:sz w:val="16"/>
+          <w:szCs w:val="16"/>
+        </w:rPr>
+      </w:pPr>
+    </w:p>
+    <w:p>
+      <w:pPr>
+        <w:spacing w:before="10" w:after="10" w:line="240" w:lineRule="auto"/>
+        <w:ind w:right="-1085"/>
+        <w:jc w:val="both"/>
+        <w:rPr>
+          <w:rFonts w:cstheme="minorHAnsi"/>
+          <w:color w:val="000000"/>
+          <w:sz w:val="16"/>
+          <w:szCs w:val="16"/>
+        </w:rPr>
+      </w:pPr>
+      <w:r>
+        <w:rPr>
+          <w:rFonts w:cstheme="minorHAnsi"/>
+          <w:b/>
+          <w:bCs/>
+          <w:color w:val="000000"/>
+          <w:sz w:val="16"/>
+          <w:szCs w:val="16"/>
+        </w:rPr>
+        <w:t>a.</w:t>
+      </w:r>
+      <w:r>
+        <w:rPr>
+          <w:rFonts w:cstheme="minorHAnsi"/>
+          <w:color w:val="000000"/>
+          <w:sz w:val="16"/>
+          <w:szCs w:val="16"/>
+        </w:rPr>
+        <w:t xml:space="preserve"> Pago total del capital del préstamo, así como el interés compensatorio fijo, penalidades, comisiones, gastos e impuestos.</w:t>
+      </w:r>
+    </w:p>
+    <w:p>
+      <w:pPr>
+        <w:spacing w:before="10" w:after="10" w:line="240" w:lineRule="auto"/>
+        <w:ind w:right="-1085"/>
+        <w:jc w:val="both"/>
+        <w:rPr>
+          <w:rFonts w:cstheme="minorHAnsi"/>
+          <w:b/>
+          <w:bCs/>
+          <w:color w:val="000000"/>
+          <w:sz w:val="16"/>
+          <w:szCs w:val="16"/>
+        </w:rPr>
+      </w:pPr>
+    </w:p>
+    <w:p>
+      <w:pPr>
+        <w:spacing w:before="10" w:after="10" w:line="240" w:lineRule="auto"/>
+        <w:ind w:right="-1085"/>
+        <w:jc w:val="both"/>
+        <w:rPr>
+          <w:rFonts w:cstheme="minorHAnsi"/>
+          <w:color w:val="000000"/>
+          <w:sz w:val="16"/>
+          <w:szCs w:val="16"/>
+        </w:rPr>
+      </w:pPr>
+      <w:r>
+        <w:rPr>
+          <w:rFonts w:cstheme="minorHAnsi"/>
+          <w:b/>
+          <w:bCs/>
+          <w:color w:val="000000"/>
+          <w:sz w:val="16"/>
+          <w:szCs w:val="16"/>
+        </w:rPr>
+        <w:t>b.</w:t>
+      </w:r>
+      <w:r>
+        <w:rPr>
+          <w:rFonts w:cstheme="minorHAnsi"/>
+          <w:color w:val="000000"/>
+          <w:sz w:val="16"/>
+          <w:szCs w:val="16"/>
+        </w:rPr>
+        <w:t xml:space="preserve"> Pago parcial del capital del préstamo y el total del interés compensatorio fijo, penalidades, comisiones, gastos e impuestos.</w:t>
+      </w:r>
+    </w:p>
+    <w:p>
+      <w:pPr>
+        <w:spacing w:before="10" w:after="10" w:line="240" w:lineRule="auto"/>
+        <w:ind w:right="-1085"/>
+        <w:jc w:val="both"/>
+        <w:rPr>
+          <w:rFonts w:cstheme="minorHAnsi"/>
+          <w:b/>
+          <w:bCs/>
+          <w:color w:val="000000"/>
+          <w:sz w:val="16"/>
+          <w:szCs w:val="16"/>
+        </w:rPr>
+      </w:pPr>
+    </w:p>
+    <w:p>
+      <w:pPr>
+        <w:spacing w:before="10" w:after="10" w:line="240" w:lineRule="auto"/>
+        <w:ind w:right="-1085"/>
+        <w:jc w:val="both"/>
+        <w:rPr>
+          <w:rFonts w:cstheme="minorHAnsi"/>
+          <w:color w:val="000000"/>
+          <w:sz w:val="16"/>
+          <w:szCs w:val="16"/>
+        </w:rPr>
+      </w:pPr>
+      <w:r>
+        <w:rPr>
+          <w:rFonts w:cstheme="minorHAnsi"/>
+          <w:b/>
+          <w:bCs/>
+          <w:color w:val="000000"/>
+          <w:sz w:val="16"/>
+          <w:szCs w:val="16"/>
+        </w:rPr>
+        <w:t>c.</w:t>
+      </w:r>
+      <w:r>
+        <w:rPr>
+          <w:rFonts w:cstheme="minorHAnsi"/>
+          <w:color w:val="000000"/>
+          <w:sz w:val="16"/>
+          <w:szCs w:val="16"/>
+        </w:rPr>
+        <w:t xml:space="preserve"> Pago total del interés compensatorio fijo, penalidades, comisiones, gastos e impuestos.</w:t>
+      </w:r>
+    </w:p>
+    <w:p>
+      <w:pPr>
+        <w:spacing w:before="10" w:after="10" w:line="240" w:lineRule="auto"/>
+        <w:ind w:right="-1085"/>
+        <w:jc w:val="both"/>
+        <w:rPr>
+          <w:rFonts w:cstheme="minorHAnsi"/>
+          <w:color w:val="000000"/>
+          <w:sz w:val="16"/>
+          <w:szCs w:val="16"/>
+        </w:rPr>
+      </w:pPr>
+    </w:p>
+    <w:p>
+      <w:pPr>
+        <w:spacing w:before="10" w:after="10" w:line="240" w:lineRule="auto"/>
+        <w:ind w:right="-1085"/>
+        <w:jc w:val="both"/>
+        <w:rPr>
+          <w:rFonts w:cstheme="minorHAnsi"/>
+          <w:b/>
+          <w:bCs/>
+          <w:color w:val="000000"/>
+          <w:sz w:val="16"/>
+          <w:szCs w:val="16"/>
+        </w:rPr>
+      </w:pPr>
+      <w:r>
+        <w:rPr>
+          <w:rFonts w:cstheme="minorHAnsi"/>
+          <w:color w:val="000000"/>
+          <w:sz w:val="16"/>
+          <w:szCs w:val="16"/>
+        </w:rPr>
+        <w:t xml:space="preserve">Los pagos antes señalados serán en efectivo y únicamente en las agencias de </w:t>
+      </w:r>
+      <w:r>
+        <w:rPr>
+          <w:rFonts w:cstheme="minorHAnsi"/>
+          <w:b/>
+          <w:bCs/>
+          <w:color w:val="000000"/>
+          <w:sz w:val="16"/>
+          <w:szCs w:val="16"/>
+        </w:rPr>
+        <w:t>CREDIÁGIL</w:t>
+      </w:r>
+      <w:r>
+        <w:rPr>
+          <w:rFonts w:cstheme="minorHAnsi"/>
+          <w:color w:val="000000"/>
+          <w:sz w:val="16"/>
+          <w:szCs w:val="16"/>
+        </w:rPr>
+        <w:t xml:space="preserve">. </w:t>
+      </w:r>
+    </w:p>
+    <w:p>
+      <w:pPr>
+        <w:spacing w:before="10" w:after="10" w:line="240" w:lineRule="auto"/>
+        <w:ind w:right="-1085"/>
+        <w:jc w:val="both"/>
+        <w:rPr>
+          <w:rFonts w:cstheme="minorHAnsi"/>
+          <w:color w:val="000000"/>
+          <w:sz w:val="16"/>
+          <w:szCs w:val="16"/>
+        </w:rPr>
+      </w:pPr>
+      <w:r>
+        <w:rPr>
+          <w:rFonts w:cstheme="minorHAnsi"/>
+          <w:color w:val="000000"/>
+          <w:sz w:val="16"/>
+          <w:szCs w:val="16"/>
+        </w:rPr>
+        <w:t xml:space="preserve">De optarse por las alternativas b o c, las partes fijarán un nuevo plazo de vencimiento </w:t>
+      </w:r>
+      <w:r>
+        <w:rPr>
+          <w:rFonts w:cstheme="minorHAnsi"/>
+          <w:color w:val="000000"/>
+          <w:sz w:val="16"/>
+          <w:szCs w:val="16"/>
+        </w:rPr>
+        <w:t>y</w:t>
+      </w:r>
+      <w:r>
+        <w:rPr>
+          <w:rFonts w:cstheme="minorHAnsi"/>
+          <w:color w:val="000000"/>
+          <w:sz w:val="16"/>
+          <w:szCs w:val="16"/>
+        </w:rPr>
+        <w:t xml:space="preserve"> </w:t>
+      </w:r>
+      <w:r>
+        <w:rPr>
+          <w:rFonts w:cstheme="minorHAnsi"/>
+          <w:b/>
+          <w:bCs/>
+          <w:color w:val="000000"/>
+          <w:sz w:val="16"/>
+          <w:szCs w:val="16"/>
+        </w:rPr>
+        <w:t>CREDIÁGIL</w:t>
+      </w:r>
+      <w:r>
+        <w:rPr>
+          <w:rFonts w:cstheme="minorHAnsi"/>
+          <w:color w:val="000000"/>
+          <w:sz w:val="16"/>
+          <w:szCs w:val="16"/>
+        </w:rPr>
+        <w:t xml:space="preserve"> determinará el saldo correspondiente del capital adeudado por </w:t>
+      </w:r>
+      <w:r>
+        <w:rPr>
+          <w:rFonts w:cstheme="minorHAnsi"/>
+          <w:b/>
+          <w:bCs/>
+          <w:color w:val="000000"/>
+          <w:sz w:val="16"/>
+          <w:szCs w:val="16"/>
+        </w:rPr>
+        <w:t>EL CLIENTE</w:t>
+      </w:r>
+      <w:r>
+        <w:rPr>
+          <w:rFonts w:cstheme="minorHAnsi"/>
+          <w:color w:val="000000"/>
+          <w:sz w:val="16"/>
+          <w:szCs w:val="16"/>
+        </w:rPr>
+        <w:t xml:space="preserve">, el cual generará un interés compensatorio fijo y en caso de incumplimiento las penalidades de ser el caso, así como las comisiones, impuestos y los gastos por los días transcurridos hasta el siguiente pago que realice </w:t>
+      </w:r>
+      <w:r>
+        <w:rPr>
+          <w:rFonts w:cstheme="minorHAnsi"/>
+          <w:b/>
+          <w:bCs/>
+          <w:color w:val="000000"/>
+          <w:sz w:val="16"/>
+          <w:szCs w:val="16"/>
+        </w:rPr>
+        <w:t>EL CLIENTE</w:t>
+      </w:r>
+      <w:r>
+        <w:rPr>
+          <w:rFonts w:cstheme="minorHAnsi"/>
+          <w:color w:val="000000"/>
+          <w:sz w:val="16"/>
+          <w:szCs w:val="16"/>
+        </w:rPr>
+        <w:t xml:space="preserve">. En ambos casos, se mantendrá vigente para todos sus efectos la Garantía Mobiliaria constituida, manteniendo </w:t>
+      </w:r>
+      <w:r>
+        <w:rPr>
+          <w:rFonts w:cstheme="minorHAnsi"/>
+          <w:b/>
+          <w:bCs/>
+          <w:color w:val="000000"/>
+          <w:sz w:val="16"/>
+          <w:szCs w:val="16"/>
+        </w:rPr>
+        <w:t>CREDIÁGIL</w:t>
+      </w:r>
+      <w:r>
+        <w:rPr>
+          <w:rFonts w:cstheme="minorHAnsi"/>
+          <w:color w:val="000000"/>
+          <w:sz w:val="16"/>
+          <w:szCs w:val="16"/>
+        </w:rPr>
+        <w:t xml:space="preserve"> en su poder los bienes otorgados en garantía por </w:t>
+      </w:r>
+      <w:r>
+        <w:rPr>
+          <w:rFonts w:cstheme="minorHAnsi"/>
+          <w:b/>
+          <w:bCs/>
+          <w:color w:val="000000"/>
+          <w:sz w:val="16"/>
+          <w:szCs w:val="16"/>
+        </w:rPr>
+        <w:t>EL CLIENTE</w:t>
+      </w:r>
+      <w:r>
+        <w:rPr>
+          <w:rFonts w:cstheme="minorHAnsi"/>
+          <w:color w:val="000000"/>
+          <w:sz w:val="16"/>
+          <w:szCs w:val="16"/>
+        </w:rPr>
+        <w:t>.</w:t>
+      </w:r>
+    </w:p>
+    <w:p>
+      <w:pPr>
+        <w:spacing w:before="10" w:after="10" w:line="240" w:lineRule="auto"/>
+        <w:ind w:right="-1085"/>
+        <w:jc w:val="both"/>
+        <w:rPr>
+          <w:rFonts w:cstheme="minorHAnsi"/>
+          <w:color w:val="000000"/>
+          <w:sz w:val="16"/>
+          <w:szCs w:val="16"/>
+        </w:rPr>
+      </w:pPr>
+    </w:p>
+    <w:p>
+      <w:pPr>
+        <w:spacing w:before="10" w:after="10" w:line="240" w:lineRule="auto"/>
+        <w:ind w:right="-1085"/>
+        <w:jc w:val="both"/>
+        <w:rPr>
+          <w:rFonts w:cstheme="minorHAnsi"/>
+          <w:color w:val="000000"/>
+          <w:sz w:val="16"/>
+          <w:szCs w:val="16"/>
+        </w:rPr>
+      </w:pPr>
+      <w:r>
+        <w:rPr>
+          <w:rFonts w:cstheme="minorHAnsi"/>
+          <w:color w:val="000000"/>
+          <w:sz w:val="16"/>
+          <w:szCs w:val="16"/>
+        </w:rPr>
+        <w:t xml:space="preserve">En el caso que </w:t>
+      </w:r>
+      <w:r>
+        <w:rPr>
+          <w:rFonts w:cstheme="minorHAnsi"/>
+          <w:b/>
+          <w:bCs/>
+          <w:color w:val="000000"/>
+          <w:sz w:val="16"/>
+          <w:szCs w:val="16"/>
+        </w:rPr>
+        <w:t>EL CLIENTE</w:t>
+      </w:r>
+      <w:r>
+        <w:rPr>
+          <w:rFonts w:cstheme="minorHAnsi"/>
+          <w:color w:val="000000"/>
+          <w:sz w:val="16"/>
+          <w:szCs w:val="16"/>
+        </w:rPr>
+        <w:t xml:space="preserve">, haya sido beneficiario de una promoción comercial otorgada por </w:t>
+      </w:r>
+      <w:r>
+        <w:rPr>
+          <w:rFonts w:cstheme="minorHAnsi"/>
+          <w:b/>
+          <w:bCs/>
+          <w:color w:val="000000"/>
+          <w:sz w:val="16"/>
+          <w:szCs w:val="16"/>
+        </w:rPr>
+        <w:t>CREDIÁGIL</w:t>
+      </w:r>
+      <w:r>
+        <w:rPr>
+          <w:rFonts w:cstheme="minorHAnsi"/>
+          <w:color w:val="000000"/>
+          <w:sz w:val="16"/>
+          <w:szCs w:val="16"/>
+        </w:rPr>
+        <w:t>, que conlleve variar el plazo de pago y/o las formas de pago indicadas en las alternativas a, b, o c, que se indican en la hoja resumen (</w:t>
+      </w:r>
+      <w:r>
+        <w:rPr>
+          <w:rFonts w:cstheme="minorHAnsi"/>
+          <w:color w:val="000000"/>
+          <w:sz w:val="16"/>
+          <w:szCs w:val="16"/>
+        </w:rPr>
+        <w:t>ANEXO</w:t>
+      </w:r>
+      <w:r>
+        <w:rPr>
+          <w:rFonts w:cstheme="minorHAnsi"/>
+          <w:color w:val="000000"/>
+          <w:sz w:val="16"/>
+          <w:szCs w:val="16"/>
+        </w:rPr>
+        <w:t xml:space="preserve"> 01), éste se obliga a cumplir las condiciones establecidas para la promoción a la que se acogió, caso contrario, perderá los beneficios de dicha promoción. </w:t>
+      </w:r>
+    </w:p>
+    <w:p>
+      <w:pPr>
+        <w:spacing w:before="10" w:after="10" w:line="240" w:lineRule="auto"/>
+        <w:ind w:right="-1085"/>
+        <w:jc w:val="both"/>
+        <w:rPr>
+          <w:rFonts w:cstheme="minorHAnsi"/>
+          <w:color w:val="000000"/>
+          <w:sz w:val="16"/>
+          <w:szCs w:val="16"/>
+        </w:rPr>
+      </w:pPr>
+    </w:p>
+    <w:p>
+      <w:pPr>
+        <w:spacing w:before="10" w:after="10" w:line="240" w:lineRule="auto"/>
+        <w:ind w:right="-1085"/>
+        <w:jc w:val="both"/>
+        <w:rPr>
+          <w:rFonts w:cstheme="minorHAnsi"/>
+          <w:color w:val="000000"/>
+          <w:sz w:val="16"/>
+          <w:szCs w:val="16"/>
+        </w:rPr>
+      </w:pPr>
+      <w:r>
+        <w:rPr>
+          <w:rFonts w:cstheme="minorHAnsi"/>
+          <w:b/>
+          <w:bCs/>
+          <w:color w:val="000000"/>
+          <w:sz w:val="16"/>
+          <w:szCs w:val="16"/>
+        </w:rPr>
+        <w:t>EL CLIENTE</w:t>
+      </w:r>
+      <w:r>
+        <w:rPr>
+          <w:rFonts w:cstheme="minorHAnsi"/>
+          <w:color w:val="000000"/>
+          <w:sz w:val="16"/>
+          <w:szCs w:val="16"/>
+        </w:rPr>
+        <w:t xml:space="preserve"> podrá efectuar pagos anticipados en forma total de su crédito, con la consecuente reducción de los intereses compensatorios, penalidades (de ser el caso), comisiones y gastos a la fecha de pago. </w:t>
+      </w:r>
+    </w:p>
+    <w:p>
+      <w:pPr>
+        <w:spacing w:before="10" w:after="10" w:line="240" w:lineRule="auto"/>
+        <w:ind w:right="-1085"/>
+        <w:jc w:val="both"/>
+        <w:rPr>
+          <w:rFonts w:cstheme="minorHAnsi"/>
+          <w:color w:val="000000"/>
+          <w:sz w:val="16"/>
+          <w:szCs w:val="16"/>
+        </w:rPr>
+      </w:pPr>
+    </w:p>
+    <w:p>
+      <w:pPr>
+        <w:spacing w:before="10" w:after="10" w:line="240" w:lineRule="auto"/>
+        <w:ind w:right="-1085"/>
+        <w:jc w:val="both"/>
+        <w:rPr>
+          <w:rFonts w:cstheme="minorHAnsi"/>
+          <w:color w:val="000000"/>
+          <w:sz w:val="16"/>
+          <w:szCs w:val="16"/>
+          <w:u w:val="single"/>
+        </w:rPr>
+      </w:pPr>
+      <w:r>
+        <w:rPr>
+          <w:rFonts w:cstheme="minorHAnsi"/>
+          <w:b/>
+          <w:bCs/>
+          <w:color w:val="000000"/>
+          <w:sz w:val="16"/>
+          <w:szCs w:val="16"/>
+          <w:u w:val="single"/>
+        </w:rPr>
+        <w:t>3.- GARANTÍA</w:t>
+      </w:r>
+    </w:p>
+    <w:p>
+      <w:pPr>
+        <w:spacing w:before="10" w:after="10" w:line="240" w:lineRule="auto"/>
+        <w:ind w:right="-1085"/>
+        <w:jc w:val="both"/>
+        <w:rPr>
+          <w:rFonts w:cstheme="minorHAnsi"/>
+          <w:color w:val="000000"/>
+          <w:sz w:val="16"/>
+          <w:szCs w:val="16"/>
+        </w:rPr>
+      </w:pPr>
+      <w:r>
+        <w:rPr>
+          <w:rFonts w:cstheme="minorHAnsi"/>
+          <w:color w:val="000000"/>
+          <w:sz w:val="16"/>
+          <w:szCs w:val="16"/>
+        </w:rPr>
+        <w:t xml:space="preserve">En respaldo del cumplimiento del pago del préstamo, interés compensatorio fijo, penalidades de ser el caso, comisiones, gastos e impuestos señalados en la Cláusula Primera, así como de cualquier otra obligación frente a </w:t>
+      </w:r>
+      <w:r>
+        <w:rPr>
+          <w:rFonts w:cstheme="minorHAnsi"/>
+          <w:b/>
+          <w:bCs/>
+          <w:color w:val="000000"/>
+          <w:sz w:val="16"/>
+          <w:szCs w:val="16"/>
+        </w:rPr>
+        <w:t>CREDIÁGIL</w:t>
+      </w:r>
+      <w:r>
+        <w:rPr>
+          <w:rFonts w:cstheme="minorHAnsi"/>
+          <w:color w:val="000000"/>
+          <w:sz w:val="16"/>
+          <w:szCs w:val="16"/>
+        </w:rPr>
+        <w:t xml:space="preserve">, presente o futura, se constituye Primera y Preferente Garantía Mobiliaria Vehicular con entrega de posesión y a plazo indeterminado a favor de </w:t>
+      </w:r>
+      <w:r>
+        <w:rPr>
+          <w:rFonts w:cstheme="minorHAnsi"/>
+          <w:b/>
+          <w:bCs/>
+          <w:color w:val="000000"/>
+          <w:sz w:val="16"/>
+          <w:szCs w:val="16"/>
+        </w:rPr>
+        <w:t>CREDIÁGIL</w:t>
+      </w:r>
+      <w:r>
+        <w:rPr>
+          <w:rFonts w:cstheme="minorHAnsi"/>
+          <w:color w:val="000000"/>
+          <w:sz w:val="16"/>
+          <w:szCs w:val="16"/>
+        </w:rPr>
+        <w:t xml:space="preserve"> hasta por la suma de S/ </w:t>
+      </w:r>
+      <w:r>
+        <w:rPr>
+          <w:rFonts w:cstheme="minorHAnsi"/>
+          <w:color w:val="000000"/>
+          <w:sz w:val="16"/>
+          <w:szCs w:val="16"/>
+        </w:rPr>
+        <w:t>${</w:t>
+      </w:r>
+      <w:r>
+        <w:rPr>
+          <w:rFonts w:cstheme="minorHAnsi"/>
+          <w:color w:val="000000"/>
+          <w:sz w:val="16"/>
+          <w:szCs w:val="16"/>
+        </w:rPr>
+        <w:t>MONTO_TASACION</w:t>
+      </w:r>
+      <w:r>
+        <w:rPr>
+          <w:rFonts w:cstheme="minorHAnsi"/>
+          <w:color w:val="000000"/>
+          <w:sz w:val="16"/>
+          <w:szCs w:val="16"/>
+        </w:rPr>
+        <w:t>}</w:t>
+      </w:r>
+      <w:r>
+        <w:rPr>
+          <w:rFonts w:cstheme="minorHAnsi"/>
+          <w:color w:val="000000"/>
+          <w:sz w:val="16"/>
+          <w:szCs w:val="16"/>
+        </w:rPr>
+        <w:t>, otorgada por:</w:t>
+      </w:r>
+    </w:p>
+    <w:p>
+      <w:pPr>
+        <w:spacing w:before="10" w:after="10" w:line="240" w:lineRule="auto"/>
+        <w:ind w:right="-1085"/>
+        <w:jc w:val="both"/>
+        <w:rPr>
+          <w:rFonts w:cstheme="minorHAnsi"/>
+          <w:color w:val="000000"/>
+          <w:sz w:val="16"/>
+          <w:szCs w:val="16"/>
+        </w:rPr>
+      </w:pPr>
+    </w:p>
+    <w:p>
+      <w:pPr>
+        <w:spacing w:before="10" w:after="10" w:line="240" w:lineRule="auto"/>
+        <w:ind w:right="-1085"/>
+        <w:jc w:val="both"/>
+        <w:rPr>
+          <w:rFonts w:cstheme="minorHAnsi"/>
+          <w:color w:val="000000"/>
+          <w:sz w:val="16"/>
+          <w:szCs w:val="16"/>
+        </w:rPr>
+      </w:pPr>
+      <w:r>
+        <w:rPr>
+          <w:rFonts w:cstheme="minorHAnsi"/>
+          <w:color w:val="000000"/>
+          <w:sz w:val="16"/>
+          <w:szCs w:val="16"/>
+        </w:rPr>
+        <w:t xml:space="preserve">a. </w:t>
+      </w:r>
+      <w:r>
+        <w:rPr>
+          <w:rFonts w:cstheme="minorHAnsi"/>
+          <w:b/>
+          <w:bCs/>
+          <w:color w:val="000000"/>
+          <w:sz w:val="16"/>
+          <w:szCs w:val="16"/>
+        </w:rPr>
+        <w:t>EL CLIENTE</w:t>
+      </w:r>
+      <w:r>
+        <w:rPr>
+          <w:rFonts w:cstheme="minorHAnsi"/>
+          <w:color w:val="000000"/>
+          <w:sz w:val="16"/>
+          <w:szCs w:val="16"/>
+        </w:rPr>
+        <w:t>, en su calidad de propietario y titular registral del vehículo, debidamente representado por su apoderado legal; o en su defecto por,</w:t>
+      </w:r>
+    </w:p>
+    <w:p>
+      <w:pPr>
+        <w:spacing w:before="10" w:after="10" w:line="240" w:lineRule="auto"/>
+        <w:ind w:right="-1085"/>
+        <w:jc w:val="both"/>
+        <w:rPr>
+          <w:rFonts w:cstheme="minorHAnsi"/>
+          <w:color w:val="000000"/>
+          <w:sz w:val="16"/>
+          <w:szCs w:val="16"/>
+        </w:rPr>
+      </w:pPr>
+    </w:p>
+    <w:p>
+      <w:pPr>
+        <w:spacing w:before="10" w:after="10" w:line="240" w:lineRule="auto"/>
+        <w:ind w:right="-1085"/>
+        <w:jc w:val="both"/>
+        <w:rPr>
+          <w:rFonts w:cstheme="minorHAnsi"/>
+          <w:color w:val="000000"/>
+          <w:sz w:val="16"/>
+          <w:szCs w:val="16"/>
+        </w:rPr>
+      </w:pPr>
+      <w:r>
+        <w:rPr>
+          <w:rFonts w:cstheme="minorHAnsi"/>
+          <w:color w:val="000000"/>
+          <w:sz w:val="16"/>
+          <w:szCs w:val="16"/>
+        </w:rPr>
+        <w:t xml:space="preserve">b. </w:t>
+      </w:r>
+      <w:r>
+        <w:rPr>
+          <w:rFonts w:cstheme="minorHAnsi"/>
+          <w:b/>
+          <w:bCs/>
+          <w:color w:val="000000"/>
+          <w:sz w:val="16"/>
+          <w:szCs w:val="16"/>
+        </w:rPr>
+        <w:t>EL GARANTE MOBILIARIO:</w:t>
+      </w:r>
+      <w:r>
+        <w:rPr>
+          <w:rFonts w:cstheme="minorHAnsi"/>
+          <w:color w:val="000000"/>
+          <w:sz w:val="16"/>
+          <w:szCs w:val="16"/>
+        </w:rPr>
+        <w:t xml:space="preserve"> El señor(a) </w:t>
+      </w:r>
+      <w:r>
+        <w:rPr>
+          <w:rFonts w:cstheme="minorHAnsi"/>
+          <w:color w:val="000000"/>
+          <w:sz w:val="16"/>
+          <w:szCs w:val="16"/>
+        </w:rPr>
+        <w:t>${</w:t>
+      </w:r>
+      <w:r>
+        <w:rPr>
+          <w:rFonts w:cstheme="minorHAnsi"/>
+          <w:color w:val="000000"/>
+          <w:sz w:val="16"/>
+          <w:szCs w:val="16"/>
+        </w:rPr>
+        <w:t>NOMBRE_GARANTE</w:t>
+      </w:r>
+      <w:r>
+        <w:rPr>
+          <w:rFonts w:cstheme="minorHAnsi"/>
+          <w:color w:val="000000"/>
+          <w:sz w:val="16"/>
+          <w:szCs w:val="16"/>
+        </w:rPr>
+        <w:t>}</w:t>
+      </w:r>
+      <w:r>
+        <w:rPr>
+          <w:rFonts w:cstheme="minorHAnsi"/>
+          <w:color w:val="000000"/>
+          <w:sz w:val="16"/>
+          <w:szCs w:val="16"/>
+        </w:rPr>
+        <w:t xml:space="preserve"> identificado con DNI </w:t>
       </w:r>
       <w:proofErr w:type="spellStart"/>
       <w:r>
@@ -381,8 +1747,6 @@
       <w:r>
         <w:rPr>
           <w:rFonts w:cstheme="minorHAnsi"/>
-          <w:b/>
-          <w:bCs/>
           <w:color w:val="000000"/>
           <w:sz w:val="16"/>
           <w:szCs w:val="16"/>
@@ -392,8 +1756,6 @@
       <w:r>
         <w:rPr>
           <w:rFonts w:cstheme="minorHAnsi"/>
-          <w:b/>
-          <w:bCs/>
           <w:color w:val="000000"/>
           <w:sz w:val="16"/>
           <w:szCs w:val="16"/>
@@ -403,19 +1765,15 @@
       <w:r>
         <w:rPr>
           <w:rFonts w:cstheme="minorHAnsi"/>
-          <w:b/>
-          <w:bCs/>
-          <w:color w:val="000000"/>
-          <w:sz w:val="16"/>
-          <w:szCs w:val="16"/>
-        </w:rPr>
-        <w:t>RUC_EMPRESA</w:t>
-      </w:r>
-      <w:r>
-        <w:rPr>
-          <w:rFonts w:cstheme="minorHAnsi"/>
-          <w:b/>
-          <w:bCs/>
+          <w:color w:val="000000"/>
+          <w:sz w:val="16"/>
+          <w:szCs w:val="16"/>
+        </w:rPr>
+        <w:t>DNI_GARANTE</w:t>
+      </w:r>
+      <w:r>
+        <w:rPr>
+          <w:rFonts w:cstheme="minorHAnsi"/>
           <w:color w:val="000000"/>
           <w:sz w:val="16"/>
           <w:szCs w:val="16"/>
@@ -429,13 +1787,103 @@
           <w:sz w:val="16"/>
           <w:szCs w:val="16"/>
         </w:rPr>
+        <w:t xml:space="preserve">, y su cónyuge </w:t>
+      </w:r>
+      <w:r>
+        <w:rPr>
+          <w:rFonts w:cstheme="minorHAnsi"/>
+          <w:color w:val="000000"/>
+          <w:sz w:val="16"/>
+          <w:szCs w:val="16"/>
+        </w:rPr>
+        <w:t>${</w:t>
+      </w:r>
+      <w:r>
+        <w:rPr>
+          <w:rFonts w:cstheme="minorHAnsi"/>
+          <w:color w:val="000000"/>
+          <w:sz w:val="16"/>
+          <w:szCs w:val="16"/>
+        </w:rPr>
+        <w:t>CONYUGE_GARANTE</w:t>
+      </w:r>
+      <w:r>
+        <w:rPr>
+          <w:rFonts w:cstheme="minorHAnsi"/>
+          <w:color w:val="000000"/>
+          <w:sz w:val="16"/>
+          <w:szCs w:val="16"/>
+        </w:rPr>
+        <w:t>}</w:t>
+      </w:r>
+      <w:r>
+        <w:rPr>
+          <w:rFonts w:cstheme="minorHAnsi"/>
+          <w:color w:val="000000"/>
+          <w:sz w:val="16"/>
+          <w:szCs w:val="16"/>
+        </w:rPr>
+        <w:t xml:space="preserve"> con DNI </w:t>
+      </w:r>
+      <w:proofErr w:type="spellStart"/>
+      <w:r>
+        <w:rPr>
+          <w:rFonts w:cstheme="minorHAnsi"/>
+          <w:color w:val="000000"/>
+          <w:sz w:val="16"/>
+          <w:szCs w:val="16"/>
+        </w:rPr>
+        <w:t>Nº</w:t>
+      </w:r>
+      <w:proofErr w:type="spellEnd"/>
+      <w:r>
+        <w:rPr>
+          <w:rFonts w:cstheme="minorHAnsi"/>
+          <w:color w:val="000000"/>
+          <w:sz w:val="16"/>
+          <w:szCs w:val="16"/>
+        </w:rPr>
+        <w:t xml:space="preserve"> </w:t>
+      </w:r>
+      <w:r>
+        <w:rPr>
+          <w:rFonts w:cstheme="minorHAnsi"/>
+          <w:color w:val="000000"/>
+          <w:sz w:val="16"/>
+          <w:szCs w:val="16"/>
+        </w:rPr>
+        <w:t>${</w:t>
+      </w:r>
+      <w:r>
+        <w:rPr>
+          <w:rFonts w:cstheme="minorHAnsi"/>
+          <w:color w:val="000000"/>
+          <w:sz w:val="16"/>
+          <w:szCs w:val="16"/>
+        </w:rPr>
+        <w:t>DNI_CONYUGE_GARANTE</w:t>
+      </w:r>
+      <w:r>
+        <w:rPr>
+          <w:rFonts w:cstheme="minorHAnsi"/>
+          <w:color w:val="000000"/>
+          <w:sz w:val="16"/>
+          <w:szCs w:val="16"/>
+        </w:rPr>
+        <w:t>}</w:t>
+      </w:r>
+      <w:r>
+        <w:rPr>
+          <w:rFonts w:cstheme="minorHAnsi"/>
+          <w:color w:val="000000"/>
+          <w:sz w:val="16"/>
+          <w:szCs w:val="16"/>
+        </w:rPr>
         <w:t xml:space="preserve">, con domicilio en </w:t>
       </w:r>
       <w:r>
         <w:rPr>
           <w:rFonts w:cstheme="minorHAnsi"/>
-          <w:b/>
-          <w:bCs/>
           <w:color w:val="000000"/>
           <w:sz w:val="16"/>
           <w:szCs w:val="16"/>
@@ -445,19 +1893,15 @@
       <w:r>
         <w:rPr>
           <w:rFonts w:cstheme="minorHAnsi"/>
-          <w:b/>
-          <w:bCs/>
-          <w:color w:val="000000"/>
-          <w:sz w:val="16"/>
-          <w:szCs w:val="16"/>
-        </w:rPr>
-        <w:t>DOMICILIO_FISCAL</w:t>
-      </w:r>
-      <w:r>
-        <w:rPr>
-          <w:rFonts w:cstheme="minorHAnsi"/>
-          <w:b/>
-          <w:bCs/>
+          <w:color w:val="000000"/>
+          <w:sz w:val="16"/>
+          <w:szCs w:val="16"/>
+        </w:rPr>
+        <w:t>DOMICILIO_GARANTE</w:t>
+      </w:r>
+      <w:r>
+        <w:rPr>
+          <w:rFonts w:cstheme="minorHAnsi"/>
           <w:color w:val="000000"/>
           <w:sz w:val="16"/>
           <w:szCs w:val="16"/>
@@ -471,13 +1915,86 @@
           <w:sz w:val="16"/>
           <w:szCs w:val="16"/>
         </w:rPr>
-        <w:t xml:space="preserve">, debidamente representada por su </w:t>
-      </w:r>
-      <w:r>
-        <w:rPr>
-          <w:rFonts w:cstheme="minorHAnsi"/>
-          <w:b/>
-          <w:bCs/>
+        <w:t xml:space="preserve">, adquiriendo en consecuencia la calidad de DEUDOR SOLIDARIO de la presente obligación asumida por </w:t>
+      </w:r>
+      <w:r>
+        <w:rPr>
+          <w:rFonts w:cstheme="minorHAnsi"/>
+          <w:b/>
+          <w:bCs/>
+          <w:color w:val="000000"/>
+          <w:sz w:val="16"/>
+          <w:szCs w:val="16"/>
+        </w:rPr>
+        <w:t>EL CLIENTE</w:t>
+      </w:r>
+      <w:r>
+        <w:rPr>
+          <w:rFonts w:cstheme="minorHAnsi"/>
+          <w:color w:val="000000"/>
+          <w:sz w:val="16"/>
+          <w:szCs w:val="16"/>
+        </w:rPr>
+        <w:t>.</w:t>
+      </w:r>
+    </w:p>
+    <w:p>
+      <w:pPr>
+        <w:spacing w:before="10" w:after="10" w:line="240" w:lineRule="auto"/>
+        <w:ind w:right="-1085"/>
+        <w:jc w:val="both"/>
+        <w:rPr>
+          <w:rFonts w:cstheme="minorHAnsi"/>
+          <w:color w:val="000000"/>
+          <w:sz w:val="16"/>
+          <w:szCs w:val="16"/>
+        </w:rPr>
+      </w:pPr>
+    </w:p>
+    <w:p>
+      <w:pPr>
+        <w:spacing w:before="10" w:after="10" w:line="240" w:lineRule="auto"/>
+        <w:ind w:right="-1085"/>
+        <w:jc w:val="both"/>
+        <w:rPr>
+          <w:rFonts w:cstheme="minorHAnsi"/>
+          <w:color w:val="000000"/>
+          <w:sz w:val="16"/>
+          <w:szCs w:val="16"/>
+        </w:rPr>
+      </w:pPr>
+      <w:r>
+        <w:rPr>
+          <w:rFonts w:cstheme="minorHAnsi"/>
+          <w:color w:val="000000"/>
+          <w:sz w:val="16"/>
+          <w:szCs w:val="16"/>
+        </w:rPr>
+        <w:t xml:space="preserve">Sobre el vehículo cuyas características técnicas (Marca, Modelo, Placa, Motor, Serie) se detallan minuciosamente en el ANEXO 01 del presente contrato. El vehículo se encuentra inscrito en la Partida Electrónica </w:t>
+      </w:r>
+      <w:proofErr w:type="spellStart"/>
+      <w:r>
+        <w:rPr>
+          <w:rFonts w:cstheme="minorHAnsi"/>
+          <w:color w:val="000000"/>
+          <w:sz w:val="16"/>
+          <w:szCs w:val="16"/>
+        </w:rPr>
+        <w:t>Nº</w:t>
+      </w:r>
+      <w:proofErr w:type="spellEnd"/>
+      <w:r>
+        <w:rPr>
+          <w:rFonts w:cstheme="minorHAnsi"/>
+          <w:color w:val="000000"/>
+          <w:sz w:val="16"/>
+          <w:szCs w:val="16"/>
+        </w:rPr>
+        <w:t xml:space="preserve"> </w:t>
+      </w:r>
+      <w:r>
+        <w:rPr>
+          <w:rFonts w:cstheme="minorHAnsi"/>
           <w:color w:val="000000"/>
           <w:sz w:val="16"/>
           <w:szCs w:val="16"/>
@@ -487,19 +2004,15 @@
       <w:r>
         <w:rPr>
           <w:rFonts w:cstheme="minorHAnsi"/>
-          <w:b/>
-          <w:bCs/>
-          <w:color w:val="000000"/>
-          <w:sz w:val="16"/>
-          <w:szCs w:val="16"/>
-        </w:rPr>
-        <w:t>CARGO_REPRESENTANTE</w:t>
-      </w:r>
-      <w:r>
-        <w:rPr>
-          <w:rFonts w:cstheme="minorHAnsi"/>
-          <w:b/>
-          <w:bCs/>
+          <w:color w:val="000000"/>
+          <w:sz w:val="16"/>
+          <w:szCs w:val="16"/>
+        </w:rPr>
+        <w:t>AUTO_PARTIDA</w:t>
+      </w:r>
+      <w:r>
+        <w:rPr>
+          <w:rFonts w:cstheme="minorHAnsi"/>
           <w:color w:val="000000"/>
           <w:sz w:val="16"/>
           <w:szCs w:val="16"/>
@@ -513,13 +2026,11 @@
           <w:sz w:val="16"/>
           <w:szCs w:val="16"/>
         </w:rPr>
-        <w:t xml:space="preserve">, el señor(a) </w:t>
-      </w:r>
-      <w:r>
-        <w:rPr>
-          <w:rFonts w:cstheme="minorHAnsi"/>
-          <w:b/>
-          <w:bCs/>
+        <w:t xml:space="preserve"> del Registro de Propiedad Vehicular de la Oficina Registral de </w:t>
+      </w:r>
+      <w:r>
+        <w:rPr>
+          <w:rFonts w:cstheme="minorHAnsi"/>
           <w:color w:val="000000"/>
           <w:sz w:val="16"/>
           <w:szCs w:val="16"/>
@@ -529,19 +2040,15 @@
       <w:r>
         <w:rPr>
           <w:rFonts w:cstheme="minorHAnsi"/>
-          <w:b/>
-          <w:bCs/>
-          <w:color w:val="000000"/>
-          <w:sz w:val="16"/>
-          <w:szCs w:val="16"/>
-        </w:rPr>
-        <w:t>NOMBRE_REPRESENTANTE</w:t>
-      </w:r>
-      <w:r>
-        <w:rPr>
-          <w:rFonts w:cstheme="minorHAnsi"/>
-          <w:b/>
-          <w:bCs/>
+          <w:color w:val="000000"/>
+          <w:sz w:val="16"/>
+          <w:szCs w:val="16"/>
+        </w:rPr>
+        <w:t>AUTO_OFICINA_REGISTRAL</w:t>
+      </w:r>
+      <w:r>
+        <w:rPr>
+          <w:rFonts w:cstheme="minorHAnsi"/>
           <w:color w:val="000000"/>
           <w:sz w:val="16"/>
           <w:szCs w:val="16"/>
@@ -555,1775 +2062,105 @@
           <w:sz w:val="16"/>
           <w:szCs w:val="16"/>
         </w:rPr>
-        <w:t xml:space="preserve">, identificado con DNI </w:t>
-      </w:r>
-      <w:proofErr w:type="spellStart"/>
-      <w:r>
-        <w:rPr>
-          <w:rFonts w:cstheme="minorHAnsi"/>
-          <w:color w:val="000000"/>
-          <w:sz w:val="16"/>
-          <w:szCs w:val="16"/>
-        </w:rPr>
-        <w:t>Nº</w:t>
-      </w:r>
-      <w:proofErr w:type="spellEnd"/>
-      <w:r>
-        <w:rPr>
-          <w:rFonts w:cstheme="minorHAnsi"/>
-          <w:color w:val="000000"/>
-          <w:sz w:val="16"/>
-          <w:szCs w:val="16"/>
-        </w:rPr>
-        <w:t xml:space="preserve"> </w:t>
-      </w:r>
-      <w:r>
-        <w:rPr>
-          <w:rFonts w:cstheme="minorHAnsi"/>
-          <w:b/>
-          <w:bCs/>
-          <w:color w:val="000000"/>
-          <w:sz w:val="16"/>
-          <w:szCs w:val="16"/>
-        </w:rPr>
-        <w:t>${</w:t>
-      </w:r>
-      <w:r>
-        <w:rPr>
-          <w:rFonts w:cstheme="minorHAnsi"/>
-          <w:b/>
-          <w:bCs/>
-          <w:color w:val="000000"/>
-          <w:sz w:val="16"/>
-          <w:szCs w:val="16"/>
-        </w:rPr>
-        <w:t>DNI_REPRESENTANTE</w:t>
-      </w:r>
-      <w:r>
-        <w:rPr>
-          <w:rFonts w:cstheme="minorHAnsi"/>
-          <w:b/>
-          <w:bCs/>
-          <w:color w:val="000000"/>
-          <w:sz w:val="16"/>
-          <w:szCs w:val="16"/>
-        </w:rPr>
-        <w:t>}</w:t>
-      </w:r>
-      <w:r>
-        <w:rPr>
-          <w:rFonts w:cstheme="minorHAnsi"/>
-          <w:color w:val="000000"/>
-          <w:sz w:val="16"/>
-          <w:szCs w:val="16"/>
-        </w:rPr>
-        <w:t xml:space="preserve">, según facultades inscritas en la </w:t>
-      </w:r>
-      <w:r>
-        <w:rPr>
-          <w:rFonts w:cstheme="minorHAnsi"/>
-          <w:b/>
-          <w:bCs/>
-          <w:color w:val="000000"/>
-          <w:sz w:val="16"/>
-          <w:szCs w:val="16"/>
-        </w:rPr>
-        <w:t xml:space="preserve">Partida Electrónica </w:t>
-      </w:r>
-      <w:proofErr w:type="spellStart"/>
-      <w:r>
-        <w:rPr>
-          <w:rFonts w:cstheme="minorHAnsi"/>
-          <w:color w:val="000000"/>
-          <w:sz w:val="16"/>
-          <w:szCs w:val="16"/>
-        </w:rPr>
-        <w:t>Nº</w:t>
-      </w:r>
-      <w:proofErr w:type="spellEnd"/>
-      <w:r>
-        <w:rPr>
-          <w:rFonts w:cstheme="minorHAnsi"/>
-          <w:b/>
-          <w:bCs/>
-          <w:color w:val="000000"/>
-          <w:sz w:val="16"/>
-          <w:szCs w:val="16"/>
-        </w:rPr>
-        <w:t xml:space="preserve"> </w:t>
-      </w:r>
-      <w:r>
-        <w:rPr>
-          <w:rFonts w:cstheme="minorHAnsi"/>
-          <w:b/>
-          <w:bCs/>
-          <w:color w:val="000000"/>
-          <w:sz w:val="16"/>
-          <w:szCs w:val="16"/>
-        </w:rPr>
-        <w:t>${</w:t>
-      </w:r>
-      <w:r>
-        <w:rPr>
-          <w:rFonts w:cstheme="minorHAnsi"/>
-          <w:b/>
-          <w:bCs/>
-          <w:color w:val="000000"/>
-          <w:sz w:val="16"/>
-          <w:szCs w:val="16"/>
-        </w:rPr>
-        <w:t>PARTIDA_EMPRESA</w:t>
-      </w:r>
-      <w:r>
-        <w:rPr>
-          <w:rFonts w:cstheme="minorHAnsi"/>
-          <w:b/>
-          <w:bCs/>
-          <w:color w:val="000000"/>
-          <w:sz w:val="16"/>
-          <w:szCs w:val="16"/>
-        </w:rPr>
-        <w:t>}</w:t>
-      </w:r>
-      <w:r>
-        <w:rPr>
-          <w:rFonts w:cstheme="minorHAnsi"/>
-          <w:color w:val="000000"/>
-          <w:sz w:val="16"/>
-          <w:szCs w:val="16"/>
-        </w:rPr>
-        <w:t xml:space="preserve"> del Registro de Personas Jurídicas de </w:t>
-      </w:r>
-      <w:r>
-        <w:rPr>
-          <w:rFonts w:cstheme="minorHAnsi"/>
-          <w:b/>
-          <w:bCs/>
-          <w:color w:val="000000"/>
-          <w:sz w:val="16"/>
-          <w:szCs w:val="16"/>
-        </w:rPr>
-        <w:t>${</w:t>
-      </w:r>
-      <w:r>
-        <w:rPr>
-          <w:rFonts w:cstheme="minorHAnsi"/>
-          <w:b/>
-          <w:bCs/>
-          <w:color w:val="000000"/>
-          <w:sz w:val="16"/>
-          <w:szCs w:val="16"/>
-        </w:rPr>
-        <w:t>CIUDAD_REGISTRO</w:t>
-      </w:r>
-      <w:r>
-        <w:rPr>
-          <w:rFonts w:cstheme="minorHAnsi"/>
-          <w:b/>
-          <w:bCs/>
-          <w:color w:val="000000"/>
-          <w:sz w:val="16"/>
-          <w:szCs w:val="16"/>
-        </w:rPr>
-        <w:t>}</w:t>
-      </w:r>
-      <w:r>
-        <w:rPr>
-          <w:rFonts w:cstheme="minorHAnsi"/>
-          <w:color w:val="000000"/>
-          <w:sz w:val="16"/>
-          <w:szCs w:val="16"/>
-        </w:rPr>
-        <w:t>.</w:t>
-      </w:r>
-    </w:p>
-    <w:p>
-      <w:pPr>
-        <w:spacing w:before="10" w:after="10" w:line="240" w:lineRule="auto"/>
-        <w:ind w:right="-1085"/>
-        <w:jc w:val="both"/>
-        <w:rPr>
-          <w:rFonts w:cstheme="minorHAnsi"/>
-          <w:color w:val="000000"/>
-          <w:sz w:val="16"/>
-          <w:szCs w:val="16"/>
-        </w:rPr>
-      </w:pPr>
-      <w:r>
-        <w:rPr>
-          <w:rFonts w:cstheme="minorHAnsi"/>
-          <w:color w:val="000000"/>
-          <w:sz w:val="16"/>
-          <w:szCs w:val="16"/>
-        </w:rPr>
-        <w:t>Ambas partes convienen en los términos y condiciones siguientes:</w:t>
-      </w:r>
-    </w:p>
-    <w:p>
-      <w:pPr>
-        <w:spacing w:before="10" w:after="10" w:line="240" w:lineRule="auto"/>
-        <w:ind w:right="-1085"/>
-        <w:jc w:val="both"/>
-        <w:rPr>
-          <w:rFonts w:cstheme="minorHAnsi"/>
-          <w:color w:val="000000"/>
-          <w:sz w:val="16"/>
-          <w:szCs w:val="16"/>
-        </w:rPr>
-      </w:pPr>
-    </w:p>
-    <w:p>
-      <w:pPr>
-        <w:spacing w:before="10" w:after="10" w:line="240" w:lineRule="auto"/>
-        <w:ind w:right="-1085"/>
-        <w:jc w:val="both"/>
-        <w:rPr>
-          <w:rFonts w:cstheme="minorHAnsi"/>
-          <w:b/>
-          <w:bCs/>
+        <w:t xml:space="preserve">. </w:t>
+      </w:r>
+      <w:r>
+        <w:rPr>
+          <w:rFonts w:cstheme="minorHAnsi"/>
+          <w:b/>
+          <w:bCs/>
+          <w:color w:val="000000"/>
+          <w:sz w:val="16"/>
+          <w:szCs w:val="16"/>
+        </w:rPr>
+        <w:t>CREDIÁGIL</w:t>
+      </w:r>
+      <w:r>
+        <w:rPr>
+          <w:rFonts w:cstheme="minorHAnsi"/>
+          <w:color w:val="000000"/>
+          <w:sz w:val="16"/>
+          <w:szCs w:val="16"/>
+        </w:rPr>
+        <w:t xml:space="preserve"> se obliga a mantener en buen estado de conservación el bien otorgado en garantía mobiliaria.</w:t>
+      </w:r>
+    </w:p>
+    <w:p>
+      <w:pPr>
+        <w:spacing w:before="10" w:after="10" w:line="240" w:lineRule="auto"/>
+        <w:ind w:right="-1085"/>
+        <w:jc w:val="both"/>
+        <w:rPr>
+          <w:rFonts w:cstheme="minorHAnsi"/>
+          <w:color w:val="000000"/>
+          <w:sz w:val="16"/>
+          <w:szCs w:val="16"/>
+        </w:rPr>
+      </w:pPr>
+    </w:p>
+    <w:p>
+      <w:pPr>
+        <w:spacing w:before="10" w:after="10" w:line="240" w:lineRule="auto"/>
+        <w:ind w:right="-1085"/>
+        <w:jc w:val="both"/>
+        <w:rPr>
+          <w:rFonts w:cstheme="minorHAnsi"/>
           <w:color w:val="000000"/>
           <w:sz w:val="16"/>
           <w:szCs w:val="16"/>
           <w:u w:val="single"/>
         </w:rPr>
       </w:pPr>
-      <w:r>
-        <w:rPr>
-          <w:rFonts w:cstheme="minorHAnsi"/>
-          <w:b/>
-          <w:bCs/>
+    </w:p>
+    <w:p>
+      <w:pPr>
+        <w:spacing w:before="10" w:after="10" w:line="240" w:lineRule="auto"/>
+        <w:ind w:right="-1085"/>
+        <w:jc w:val="both"/>
+        <w:rPr>
+          <w:rFonts w:cstheme="minorHAnsi"/>
+          <w:color w:val="000000"/>
+          <w:sz w:val="16"/>
+          <w:szCs w:val="16"/>
+        </w:rPr>
+      </w:pPr>
+    </w:p>
+    <w:p>
+      <w:pPr>
+        <w:spacing w:before="10" w:after="10" w:line="240" w:lineRule="auto"/>
+        <w:ind w:right="-1085"/>
+        <w:jc w:val="both"/>
+        <w:rPr>
+          <w:rFonts w:cstheme="minorHAnsi"/>
+          <w:color w:val="000000"/>
+          <w:sz w:val="16"/>
+          <w:szCs w:val="16"/>
+        </w:rPr>
+      </w:pPr>
+    </w:p>
+    <w:p>
+      <w:pPr>
+        <w:spacing w:before="10" w:after="10" w:line="240" w:lineRule="auto"/>
+        <w:ind w:right="-1085"/>
+        <w:jc w:val="both"/>
+        <w:rPr>
+          <w:rFonts w:cstheme="minorHAnsi"/>
+          <w:b/>
           <w:color w:val="000000"/>
           <w:sz w:val="16"/>
           <w:szCs w:val="16"/>
           <w:u w:val="single"/>
         </w:rPr>
-        <w:t>1.- OBJETO</w:t>
-      </w:r>
-    </w:p>
-    <w:p>
-      <w:pPr>
-        <w:spacing w:before="10" w:after="10" w:line="240" w:lineRule="auto"/>
-        <w:ind w:right="-1085"/>
-        <w:jc w:val="both"/>
-        <w:rPr>
-          <w:rFonts w:cstheme="minorHAnsi"/>
-          <w:color w:val="000000"/>
-          <w:sz w:val="16"/>
-          <w:szCs w:val="16"/>
-        </w:rPr>
-      </w:pPr>
-      <w:r>
-        <w:rPr>
-          <w:rFonts w:cstheme="minorHAnsi"/>
-          <w:b/>
-          <w:bCs/>
-          <w:color w:val="000000"/>
-          <w:sz w:val="16"/>
-          <w:szCs w:val="16"/>
-        </w:rPr>
-        <w:t>CREDIÁGIL</w:t>
-      </w:r>
-      <w:r>
-        <w:rPr>
-          <w:rFonts w:cstheme="minorHAnsi"/>
-          <w:color w:val="000000"/>
-          <w:sz w:val="16"/>
-          <w:szCs w:val="16"/>
-        </w:rPr>
-        <w:t xml:space="preserve"> otorga a </w:t>
-      </w:r>
-      <w:r>
-        <w:rPr>
-          <w:rFonts w:cstheme="minorHAnsi"/>
-          <w:b/>
-          <w:bCs/>
-          <w:color w:val="000000"/>
-          <w:sz w:val="16"/>
-          <w:szCs w:val="16"/>
-        </w:rPr>
-        <w:t>EL CLIENTE</w:t>
-      </w:r>
-      <w:r>
-        <w:rPr>
-          <w:rFonts w:cstheme="minorHAnsi"/>
-          <w:color w:val="000000"/>
-          <w:sz w:val="16"/>
-          <w:szCs w:val="16"/>
-        </w:rPr>
-        <w:t xml:space="preserve"> en calidad de Préstamo la suma de S/ </w:t>
-      </w:r>
-      <w:r>
-        <w:rPr>
-          <w:rFonts w:cstheme="minorHAnsi"/>
-          <w:b/>
-          <w:bCs/>
-          <w:color w:val="000000"/>
-          <w:sz w:val="16"/>
-          <w:szCs w:val="16"/>
-        </w:rPr>
-        <w:t>${</w:t>
-      </w:r>
-      <w:r>
-        <w:rPr>
-          <w:rFonts w:cstheme="minorHAnsi"/>
-          <w:b/>
-          <w:bCs/>
-          <w:color w:val="000000"/>
-          <w:sz w:val="16"/>
-          <w:szCs w:val="16"/>
-        </w:rPr>
-        <w:t>MONTO_PRESTAMO</w:t>
-      </w:r>
-      <w:r>
-        <w:rPr>
-          <w:rFonts w:cstheme="minorHAnsi"/>
-          <w:b/>
-          <w:bCs/>
-          <w:color w:val="000000"/>
-          <w:sz w:val="16"/>
-          <w:szCs w:val="16"/>
-        </w:rPr>
-        <w:t>}</w:t>
-      </w:r>
-      <w:r>
-        <w:rPr>
-          <w:rFonts w:cstheme="minorHAnsi"/>
-          <w:color w:val="000000"/>
-          <w:sz w:val="16"/>
-          <w:szCs w:val="16"/>
-        </w:rPr>
-        <w:t xml:space="preserve"> (</w:t>
-      </w:r>
-      <w:r>
-        <w:rPr>
-          <w:rFonts w:cstheme="minorHAnsi"/>
-          <w:b/>
-          <w:bCs/>
-          <w:color w:val="000000"/>
-          <w:sz w:val="16"/>
-          <w:szCs w:val="16"/>
-        </w:rPr>
-        <w:t>${</w:t>
-      </w:r>
-      <w:r>
-        <w:rPr>
-          <w:rFonts w:cstheme="minorHAnsi"/>
-          <w:b/>
-          <w:bCs/>
-          <w:color w:val="000000"/>
-          <w:sz w:val="16"/>
-          <w:szCs w:val="16"/>
-        </w:rPr>
-        <w:t>LETRAS_PRESTAMO</w:t>
-      </w:r>
-      <w:r>
-        <w:rPr>
-          <w:rFonts w:cstheme="minorHAnsi"/>
-          <w:b/>
-          <w:bCs/>
-          <w:color w:val="000000"/>
-          <w:sz w:val="16"/>
-          <w:szCs w:val="16"/>
-        </w:rPr>
-        <w:t>}</w:t>
-      </w:r>
-      <w:r>
-        <w:rPr>
-          <w:rFonts w:cstheme="minorHAnsi"/>
-          <w:color w:val="000000"/>
-          <w:sz w:val="16"/>
-          <w:szCs w:val="16"/>
-        </w:rPr>
-        <w:t xml:space="preserve"> Y 00/100 SOLES) el mismo que generará los intereses compensatorios, y en caso de incumplimiento las penalidades, así como las comisiones, impuestos y los gastos detallados en la hoja resumen (</w:t>
-      </w:r>
-      <w:r>
-        <w:rPr>
-          <w:rFonts w:cstheme="minorHAnsi"/>
-          <w:b/>
-          <w:bCs/>
-          <w:color w:val="000000"/>
-          <w:sz w:val="16"/>
-          <w:szCs w:val="16"/>
-        </w:rPr>
-        <w:t>ANEXO 02</w:t>
-      </w:r>
-      <w:r>
-        <w:rPr>
-          <w:rFonts w:cstheme="minorHAnsi"/>
-          <w:color w:val="000000"/>
-          <w:sz w:val="16"/>
-          <w:szCs w:val="16"/>
-        </w:rPr>
-        <w:t>), la misma que cuenta con todos los supuestos descritos en el artículo 18 del Reglamento de Transparencia de la Información y Contratación con Usuarios del Sistema Financiero.</w:t>
-      </w:r>
-    </w:p>
-    <w:p>
-      <w:pPr>
-        <w:spacing w:before="10" w:after="10" w:line="240" w:lineRule="auto"/>
-        <w:ind w:right="-1085"/>
-        <w:jc w:val="both"/>
-        <w:rPr>
-          <w:rFonts w:cstheme="minorHAnsi"/>
-          <w:color w:val="000000"/>
-          <w:sz w:val="16"/>
-          <w:szCs w:val="16"/>
-        </w:rPr>
-      </w:pPr>
-    </w:p>
-    <w:p>
-      <w:pPr>
-        <w:spacing w:before="10" w:after="10" w:line="240" w:lineRule="auto"/>
-        <w:ind w:right="-1085"/>
-        <w:jc w:val="both"/>
-        <w:rPr>
-          <w:rFonts w:cstheme="minorHAnsi"/>
-          <w:b/>
-          <w:bCs/>
+      </w:pPr>
+      <w:r>
+        <w:rPr>
+          <w:rFonts w:cstheme="minorHAnsi"/>
+          <w:b/>
           <w:color w:val="000000"/>
           <w:sz w:val="16"/>
           <w:szCs w:val="16"/>
           <w:u w:val="single"/>
         </w:rPr>
-      </w:pPr>
-      <w:r>
-        <w:rPr>
-          <w:rFonts w:cstheme="minorHAnsi"/>
-          <w:b/>
-          <w:bCs/>
-          <w:color w:val="000000"/>
-          <w:sz w:val="16"/>
-          <w:szCs w:val="16"/>
-          <w:u w:val="single"/>
-        </w:rPr>
-        <w:t>2.- PLAZO Y PAGO DEL PRÉSTAMO</w:t>
-      </w:r>
-    </w:p>
-    <w:p>
-      <w:pPr>
-        <w:spacing w:before="10" w:after="10" w:line="240" w:lineRule="auto"/>
-        <w:ind w:right="-1085"/>
-        <w:jc w:val="both"/>
-        <w:rPr>
-          <w:rFonts w:cstheme="minorHAnsi"/>
-          <w:color w:val="000000"/>
-          <w:sz w:val="16"/>
-          <w:szCs w:val="16"/>
-        </w:rPr>
-      </w:pPr>
-      <w:r>
-        <w:rPr>
-          <w:rFonts w:cstheme="minorHAnsi"/>
-          <w:color w:val="000000"/>
-          <w:sz w:val="16"/>
-          <w:szCs w:val="16"/>
-        </w:rPr>
-        <w:t xml:space="preserve">El plazo que otorga </w:t>
-      </w:r>
-      <w:r>
-        <w:rPr>
-          <w:rFonts w:cstheme="minorHAnsi"/>
-          <w:b/>
-          <w:bCs/>
-          <w:color w:val="000000"/>
-          <w:sz w:val="16"/>
-          <w:szCs w:val="16"/>
-        </w:rPr>
-        <w:t>CREDIÁGIL</w:t>
-      </w:r>
-      <w:r>
-        <w:rPr>
-          <w:rFonts w:cstheme="minorHAnsi"/>
-          <w:color w:val="000000"/>
-          <w:sz w:val="16"/>
-          <w:szCs w:val="16"/>
-        </w:rPr>
-        <w:t xml:space="preserve"> a </w:t>
-      </w:r>
-      <w:r>
-        <w:rPr>
-          <w:rFonts w:cstheme="minorHAnsi"/>
-          <w:b/>
-          <w:bCs/>
-          <w:color w:val="000000"/>
-          <w:sz w:val="16"/>
-          <w:szCs w:val="16"/>
-        </w:rPr>
-        <w:t>EL CLIENTE</w:t>
-      </w:r>
-      <w:r>
-        <w:rPr>
-          <w:rFonts w:cstheme="minorHAnsi"/>
-          <w:color w:val="000000"/>
-          <w:sz w:val="16"/>
-          <w:szCs w:val="16"/>
-        </w:rPr>
-        <w:t xml:space="preserve"> para el pago de su préstamo es de </w:t>
-      </w:r>
-      <w:r>
-        <w:rPr>
-          <w:rFonts w:cstheme="minorHAnsi"/>
-          <w:b/>
-          <w:bCs/>
-          <w:color w:val="000000"/>
-          <w:sz w:val="16"/>
-          <w:szCs w:val="16"/>
-        </w:rPr>
-        <w:t>${</w:t>
-      </w:r>
-      <w:r>
-        <w:rPr>
-          <w:rFonts w:cstheme="minorHAnsi"/>
-          <w:b/>
-          <w:bCs/>
-          <w:color w:val="000000"/>
-          <w:sz w:val="16"/>
-          <w:szCs w:val="16"/>
-        </w:rPr>
-        <w:t>PLAZO_DIAS</w:t>
-      </w:r>
-      <w:r>
-        <w:rPr>
-          <w:rFonts w:cstheme="minorHAnsi"/>
-          <w:b/>
-          <w:bCs/>
-          <w:color w:val="000000"/>
-          <w:sz w:val="16"/>
-          <w:szCs w:val="16"/>
-        </w:rPr>
-        <w:t>}</w:t>
-      </w:r>
-      <w:r>
-        <w:rPr>
-          <w:rFonts w:cstheme="minorHAnsi"/>
-          <w:b/>
-          <w:bCs/>
-          <w:color w:val="000000"/>
-          <w:sz w:val="16"/>
-          <w:szCs w:val="16"/>
-        </w:rPr>
-        <w:t xml:space="preserve"> días calendario</w:t>
-      </w:r>
-      <w:r>
-        <w:rPr>
-          <w:rFonts w:cstheme="minorHAnsi"/>
-          <w:color w:val="000000"/>
-          <w:sz w:val="16"/>
-          <w:szCs w:val="16"/>
-        </w:rPr>
-        <w:t xml:space="preserve">, a cuyo vencimiento </w:t>
-      </w:r>
-      <w:r>
-        <w:rPr>
-          <w:rFonts w:cstheme="minorHAnsi"/>
-          <w:b/>
-          <w:bCs/>
-          <w:color w:val="000000"/>
-          <w:sz w:val="16"/>
-          <w:szCs w:val="16"/>
-        </w:rPr>
-        <w:t>EL CLIENTE</w:t>
-      </w:r>
-      <w:r>
-        <w:rPr>
-          <w:rFonts w:cstheme="minorHAnsi"/>
-          <w:color w:val="000000"/>
-          <w:sz w:val="16"/>
-          <w:szCs w:val="16"/>
-        </w:rPr>
-        <w:t xml:space="preserve"> podrá optar por alguna de las siguientes alternativas:</w:t>
-      </w:r>
-    </w:p>
-    <w:p>
-      <w:pPr>
-        <w:spacing w:before="10" w:after="10" w:line="240" w:lineRule="auto"/>
-        <w:ind w:right="-1085"/>
-        <w:jc w:val="both"/>
-        <w:rPr>
-          <w:rFonts w:cstheme="minorHAnsi"/>
-          <w:b/>
-          <w:bCs/>
-          <w:color w:val="000000"/>
-          <w:sz w:val="16"/>
-          <w:szCs w:val="16"/>
-        </w:rPr>
-      </w:pPr>
-    </w:p>
-    <w:p>
-      <w:pPr>
-        <w:spacing w:before="10" w:after="10" w:line="240" w:lineRule="auto"/>
-        <w:ind w:right="-1085"/>
-        <w:jc w:val="both"/>
-        <w:rPr>
-          <w:rFonts w:cstheme="minorHAnsi"/>
-          <w:color w:val="000000"/>
-          <w:sz w:val="16"/>
-          <w:szCs w:val="16"/>
-        </w:rPr>
-      </w:pPr>
-      <w:r>
-        <w:rPr>
-          <w:rFonts w:cstheme="minorHAnsi"/>
-          <w:b/>
-          <w:bCs/>
-          <w:color w:val="000000"/>
-          <w:sz w:val="16"/>
-          <w:szCs w:val="16"/>
-        </w:rPr>
-        <w:t>a.</w:t>
-      </w:r>
-      <w:r>
-        <w:rPr>
-          <w:rFonts w:cstheme="minorHAnsi"/>
-          <w:color w:val="000000"/>
-          <w:sz w:val="16"/>
-          <w:szCs w:val="16"/>
-        </w:rPr>
-        <w:t xml:space="preserve"> Pago total del capital del préstamo, así como el interés compensatorio fijo, penalidades, comisiones, gastos e impuestos.</w:t>
-      </w:r>
-    </w:p>
-    <w:p>
-      <w:pPr>
-        <w:spacing w:before="10" w:after="10" w:line="240" w:lineRule="auto"/>
-        <w:ind w:right="-1085"/>
-        <w:jc w:val="both"/>
-        <w:rPr>
-          <w:rFonts w:cstheme="minorHAnsi"/>
-          <w:b/>
-          <w:bCs/>
-          <w:color w:val="000000"/>
-          <w:sz w:val="16"/>
-          <w:szCs w:val="16"/>
-        </w:rPr>
-      </w:pPr>
-    </w:p>
-    <w:p>
-      <w:pPr>
-        <w:spacing w:before="10" w:after="10" w:line="240" w:lineRule="auto"/>
-        <w:ind w:right="-1085"/>
-        <w:jc w:val="both"/>
-        <w:rPr>
-          <w:rFonts w:cstheme="minorHAnsi"/>
-          <w:color w:val="000000"/>
-          <w:sz w:val="16"/>
-          <w:szCs w:val="16"/>
-        </w:rPr>
-      </w:pPr>
-      <w:r>
-        <w:rPr>
-          <w:rFonts w:cstheme="minorHAnsi"/>
-          <w:b/>
-          <w:bCs/>
-          <w:color w:val="000000"/>
-          <w:sz w:val="16"/>
-          <w:szCs w:val="16"/>
-        </w:rPr>
-        <w:t>b.</w:t>
-      </w:r>
-      <w:r>
-        <w:rPr>
-          <w:rFonts w:cstheme="minorHAnsi"/>
-          <w:color w:val="000000"/>
-          <w:sz w:val="16"/>
-          <w:szCs w:val="16"/>
-        </w:rPr>
-        <w:t xml:space="preserve"> Pago parcial del capital del préstamo y el total del interés compensatorio fijo, penalidades, comisiones, gastos e impuestos.</w:t>
-      </w:r>
-    </w:p>
-    <w:p>
-      <w:pPr>
-        <w:spacing w:before="10" w:after="10" w:line="240" w:lineRule="auto"/>
-        <w:ind w:right="-1085"/>
-        <w:jc w:val="both"/>
-        <w:rPr>
-          <w:rFonts w:cstheme="minorHAnsi"/>
-          <w:b/>
-          <w:bCs/>
-          <w:color w:val="000000"/>
-          <w:sz w:val="16"/>
-          <w:szCs w:val="16"/>
-        </w:rPr>
-      </w:pPr>
-    </w:p>
-    <w:p>
-      <w:pPr>
-        <w:spacing w:before="10" w:after="10" w:line="240" w:lineRule="auto"/>
-        <w:ind w:right="-1085"/>
-        <w:jc w:val="both"/>
-        <w:rPr>
-          <w:rFonts w:cstheme="minorHAnsi"/>
-          <w:color w:val="000000"/>
-          <w:sz w:val="16"/>
-          <w:szCs w:val="16"/>
-        </w:rPr>
-      </w:pPr>
-      <w:r>
-        <w:rPr>
-          <w:rFonts w:cstheme="minorHAnsi"/>
-          <w:b/>
-          <w:bCs/>
-          <w:color w:val="000000"/>
-          <w:sz w:val="16"/>
-          <w:szCs w:val="16"/>
-        </w:rPr>
-        <w:t>c.</w:t>
-      </w:r>
-      <w:r>
-        <w:rPr>
-          <w:rFonts w:cstheme="minorHAnsi"/>
-          <w:color w:val="000000"/>
-          <w:sz w:val="16"/>
-          <w:szCs w:val="16"/>
-        </w:rPr>
-        <w:t xml:space="preserve"> Pago total del interés compensatorio fijo, penalidades, comisiones, gastos e impuestos.</w:t>
-      </w:r>
-    </w:p>
-    <w:p>
-      <w:pPr>
-        <w:spacing w:before="10" w:after="10" w:line="240" w:lineRule="auto"/>
-        <w:ind w:right="-1085"/>
-        <w:jc w:val="both"/>
-        <w:rPr>
-          <w:rFonts w:cstheme="minorHAnsi"/>
-          <w:color w:val="000000"/>
-          <w:sz w:val="16"/>
-          <w:szCs w:val="16"/>
-        </w:rPr>
-      </w:pPr>
-    </w:p>
-    <w:p>
-      <w:pPr>
-        <w:spacing w:before="10" w:after="10" w:line="240" w:lineRule="auto"/>
-        <w:ind w:right="-1085"/>
-        <w:jc w:val="both"/>
-        <w:rPr>
-          <w:rFonts w:cstheme="minorHAnsi"/>
-          <w:b/>
-          <w:bCs/>
-          <w:color w:val="000000"/>
-          <w:sz w:val="16"/>
-          <w:szCs w:val="16"/>
-        </w:rPr>
-      </w:pPr>
-      <w:r>
-        <w:rPr>
-          <w:rFonts w:cstheme="minorHAnsi"/>
-          <w:color w:val="000000"/>
-          <w:sz w:val="16"/>
-          <w:szCs w:val="16"/>
-        </w:rPr>
-        <w:t xml:space="preserve">Los pagos antes señalados serán en efectivo y únicamente en las agencias de </w:t>
-      </w:r>
-      <w:r>
-        <w:rPr>
-          <w:rFonts w:cstheme="minorHAnsi"/>
-          <w:b/>
-          <w:bCs/>
-          <w:color w:val="000000"/>
-          <w:sz w:val="16"/>
-          <w:szCs w:val="16"/>
-        </w:rPr>
-        <w:t>CREDIÁGIL</w:t>
-      </w:r>
-      <w:r>
-        <w:rPr>
-          <w:rFonts w:cstheme="minorHAnsi"/>
-          <w:color w:val="000000"/>
-          <w:sz w:val="16"/>
-          <w:szCs w:val="16"/>
-        </w:rPr>
-        <w:t xml:space="preserve">. </w:t>
-      </w:r>
-    </w:p>
-    <w:p>
-      <w:pPr>
-        <w:spacing w:before="10" w:after="10" w:line="240" w:lineRule="auto"/>
-        <w:ind w:right="-1085"/>
-        <w:jc w:val="both"/>
-        <w:rPr>
-          <w:rFonts w:cstheme="minorHAnsi"/>
-          <w:color w:val="000000"/>
-          <w:sz w:val="16"/>
-          <w:szCs w:val="16"/>
-        </w:rPr>
-      </w:pPr>
-      <w:r>
-        <w:rPr>
-          <w:rFonts w:cstheme="minorHAnsi"/>
-          <w:color w:val="000000"/>
-          <w:sz w:val="16"/>
-          <w:szCs w:val="16"/>
-        </w:rPr>
-        <w:t xml:space="preserve">De optarse por las alternativas b o c, las partes fijarán un nuevo plazo de vencimiento </w:t>
-      </w:r>
-      <w:r>
-        <w:rPr>
-          <w:rFonts w:cstheme="minorHAnsi"/>
-          <w:color w:val="000000"/>
-          <w:sz w:val="16"/>
-          <w:szCs w:val="16"/>
-        </w:rPr>
-        <w:t>y</w:t>
-      </w:r>
-      <w:r>
-        <w:rPr>
-          <w:rFonts w:cstheme="minorHAnsi"/>
-          <w:color w:val="000000"/>
-          <w:sz w:val="16"/>
-          <w:szCs w:val="16"/>
-        </w:rPr>
-        <w:t xml:space="preserve"> </w:t>
-      </w:r>
-      <w:r>
-        <w:rPr>
-          <w:rFonts w:cstheme="minorHAnsi"/>
-          <w:b/>
-          <w:bCs/>
-          <w:color w:val="000000"/>
-          <w:sz w:val="16"/>
-          <w:szCs w:val="16"/>
-        </w:rPr>
-        <w:t>CREDIÁGIL</w:t>
-      </w:r>
-      <w:r>
-        <w:rPr>
-          <w:rFonts w:cstheme="minorHAnsi"/>
-          <w:color w:val="000000"/>
-          <w:sz w:val="16"/>
-          <w:szCs w:val="16"/>
-        </w:rPr>
-        <w:t xml:space="preserve"> determinará el saldo correspondiente del capital adeudado por </w:t>
-      </w:r>
-      <w:r>
-        <w:rPr>
-          <w:rFonts w:cstheme="minorHAnsi"/>
-          <w:b/>
-          <w:bCs/>
-          <w:color w:val="000000"/>
-          <w:sz w:val="16"/>
-          <w:szCs w:val="16"/>
-        </w:rPr>
-        <w:t>EL CLIENTE</w:t>
-      </w:r>
-      <w:r>
-        <w:rPr>
-          <w:rFonts w:cstheme="minorHAnsi"/>
-          <w:color w:val="000000"/>
-          <w:sz w:val="16"/>
-          <w:szCs w:val="16"/>
-        </w:rPr>
-        <w:t xml:space="preserve">, el cual generará un interés compensatorio fijo y en caso de incumplimiento las penalidades de ser el caso, así como las comisiones, impuestos y los gastos por los días transcurridos hasta el siguiente pago que realice </w:t>
-      </w:r>
-      <w:r>
-        <w:rPr>
-          <w:rFonts w:cstheme="minorHAnsi"/>
-          <w:b/>
-          <w:bCs/>
-          <w:color w:val="000000"/>
-          <w:sz w:val="16"/>
-          <w:szCs w:val="16"/>
-        </w:rPr>
-        <w:t>EL CLIENTE</w:t>
-      </w:r>
-      <w:r>
-        <w:rPr>
-          <w:rFonts w:cstheme="minorHAnsi"/>
-          <w:color w:val="000000"/>
-          <w:sz w:val="16"/>
-          <w:szCs w:val="16"/>
-        </w:rPr>
-        <w:t xml:space="preserve">. En ambos casos, se mantendrá vigente para todos sus efectos la Garantía Mobiliaria constituida, manteniendo </w:t>
-      </w:r>
-      <w:r>
-        <w:rPr>
-          <w:rFonts w:cstheme="minorHAnsi"/>
-          <w:b/>
-          <w:bCs/>
-          <w:color w:val="000000"/>
-          <w:sz w:val="16"/>
-          <w:szCs w:val="16"/>
-        </w:rPr>
-        <w:t>CREDIÁGIL</w:t>
-      </w:r>
-      <w:r>
-        <w:rPr>
-          <w:rFonts w:cstheme="minorHAnsi"/>
-          <w:color w:val="000000"/>
-          <w:sz w:val="16"/>
-          <w:szCs w:val="16"/>
-        </w:rPr>
-        <w:t xml:space="preserve"> en su poder los bienes otorgados en garantía por </w:t>
-      </w:r>
-      <w:r>
-        <w:rPr>
-          <w:rFonts w:cstheme="minorHAnsi"/>
-          <w:b/>
-          <w:bCs/>
-          <w:color w:val="000000"/>
-          <w:sz w:val="16"/>
-          <w:szCs w:val="16"/>
-        </w:rPr>
-        <w:t>EL CLIENTE</w:t>
-      </w:r>
-      <w:r>
-        <w:rPr>
-          <w:rFonts w:cstheme="minorHAnsi"/>
-          <w:color w:val="000000"/>
-          <w:sz w:val="16"/>
-          <w:szCs w:val="16"/>
-        </w:rPr>
-        <w:t>.</w:t>
-      </w:r>
-    </w:p>
-    <w:p>
-      <w:pPr>
-        <w:spacing w:before="10" w:after="10" w:line="240" w:lineRule="auto"/>
-        <w:ind w:right="-1085"/>
-        <w:jc w:val="both"/>
-        <w:rPr>
-          <w:rFonts w:cstheme="minorHAnsi"/>
-          <w:color w:val="000000"/>
-          <w:sz w:val="16"/>
-          <w:szCs w:val="16"/>
-        </w:rPr>
-      </w:pPr>
-    </w:p>
-    <w:p>
-      <w:pPr>
-        <w:spacing w:before="10" w:after="10" w:line="240" w:lineRule="auto"/>
-        <w:ind w:right="-1085"/>
-        <w:jc w:val="both"/>
-        <w:rPr>
-          <w:rFonts w:cstheme="minorHAnsi"/>
-          <w:color w:val="000000"/>
-          <w:sz w:val="16"/>
-          <w:szCs w:val="16"/>
-        </w:rPr>
-      </w:pPr>
-      <w:r>
-        <w:rPr>
-          <w:rFonts w:cstheme="minorHAnsi"/>
-          <w:color w:val="000000"/>
-          <w:sz w:val="16"/>
-          <w:szCs w:val="16"/>
-        </w:rPr>
-        <w:t xml:space="preserve">En el caso que </w:t>
-      </w:r>
-      <w:r>
-        <w:rPr>
-          <w:rFonts w:cstheme="minorHAnsi"/>
-          <w:b/>
-          <w:bCs/>
-          <w:color w:val="000000"/>
-          <w:sz w:val="16"/>
-          <w:szCs w:val="16"/>
-        </w:rPr>
-        <w:t>EL CLIENTE</w:t>
-      </w:r>
-      <w:r>
-        <w:rPr>
-          <w:rFonts w:cstheme="minorHAnsi"/>
-          <w:color w:val="000000"/>
-          <w:sz w:val="16"/>
-          <w:szCs w:val="16"/>
-        </w:rPr>
-        <w:t xml:space="preserve">, haya sido beneficiario de una promoción comercial otorgada por </w:t>
-      </w:r>
-      <w:r>
-        <w:rPr>
-          <w:rFonts w:cstheme="minorHAnsi"/>
-          <w:b/>
-          <w:bCs/>
-          <w:color w:val="000000"/>
-          <w:sz w:val="16"/>
-          <w:szCs w:val="16"/>
-        </w:rPr>
-        <w:t>CREDIÁGIL</w:t>
-      </w:r>
-      <w:r>
-        <w:rPr>
-          <w:rFonts w:cstheme="minorHAnsi"/>
-          <w:color w:val="000000"/>
-          <w:sz w:val="16"/>
-          <w:szCs w:val="16"/>
-        </w:rPr>
-        <w:t>, que conlleve variar el plazo de pago y/o las formas de pago indicadas en las alternativas a, b, o c, que se indican en la hoja resumen (</w:t>
-      </w:r>
-      <w:r>
-        <w:rPr>
-          <w:rFonts w:cstheme="minorHAnsi"/>
-          <w:color w:val="000000"/>
-          <w:sz w:val="16"/>
-          <w:szCs w:val="16"/>
-        </w:rPr>
-        <w:t>ANEXO</w:t>
-      </w:r>
-      <w:r>
-        <w:rPr>
-          <w:rFonts w:cstheme="minorHAnsi"/>
-          <w:color w:val="000000"/>
-          <w:sz w:val="16"/>
-          <w:szCs w:val="16"/>
-        </w:rPr>
-        <w:t xml:space="preserve"> 01), éste se obliga a cumplir las condiciones establecidas para la promoción a la que se acogió, caso contrario, perderá los beneficios de dicha promoción. </w:t>
-      </w:r>
-    </w:p>
-    <w:p>
-      <w:pPr>
-        <w:spacing w:before="10" w:after="10" w:line="240" w:lineRule="auto"/>
-        <w:ind w:right="-1085"/>
-        <w:jc w:val="both"/>
-        <w:rPr>
-          <w:rFonts w:cstheme="minorHAnsi"/>
-          <w:color w:val="000000"/>
-          <w:sz w:val="16"/>
-          <w:szCs w:val="16"/>
-        </w:rPr>
-      </w:pPr>
-    </w:p>
-    <w:p>
-      <w:pPr>
-        <w:spacing w:before="10" w:after="10" w:line="240" w:lineRule="auto"/>
-        <w:ind w:right="-1085"/>
-        <w:jc w:val="both"/>
-        <w:rPr>
-          <w:rFonts w:cstheme="minorHAnsi"/>
-          <w:color w:val="000000"/>
-          <w:sz w:val="16"/>
-          <w:szCs w:val="16"/>
-        </w:rPr>
-      </w:pPr>
-      <w:r>
-        <w:rPr>
-          <w:rFonts w:cstheme="minorHAnsi"/>
-          <w:b/>
-          <w:bCs/>
-          <w:color w:val="000000"/>
-          <w:sz w:val="16"/>
-          <w:szCs w:val="16"/>
-        </w:rPr>
-        <w:t>EL CLIENTE</w:t>
-      </w:r>
-      <w:r>
-        <w:rPr>
-          <w:rFonts w:cstheme="minorHAnsi"/>
-          <w:color w:val="000000"/>
-          <w:sz w:val="16"/>
-          <w:szCs w:val="16"/>
-        </w:rPr>
-        <w:t xml:space="preserve"> podrá efectuar pagos anticipados en forma total de su crédito, con la consecuente reducción de los intereses compensatorios, penalidades (de ser el caso), comisiones y gastos a la fecha de pago. </w:t>
-      </w:r>
-    </w:p>
-    <w:p>
-      <w:pPr>
-        <w:spacing w:before="10" w:after="10" w:line="240" w:lineRule="auto"/>
-        <w:ind w:right="-1085"/>
-        <w:jc w:val="both"/>
-        <w:rPr>
-          <w:rFonts w:cstheme="minorHAnsi"/>
-          <w:color w:val="000000"/>
-          <w:sz w:val="16"/>
-          <w:szCs w:val="16"/>
-        </w:rPr>
-      </w:pPr>
-    </w:p>
-    <w:p>
-      <w:pPr>
-        <w:spacing w:before="10" w:after="10" w:line="240" w:lineRule="auto"/>
-        <w:ind w:right="-1085"/>
-        <w:jc w:val="both"/>
-        <w:rPr>
-          <w:rFonts w:cstheme="minorHAnsi"/>
-          <w:color w:val="000000"/>
-          <w:sz w:val="16"/>
-          <w:szCs w:val="16"/>
-          <w:u w:val="single"/>
-        </w:rPr>
-      </w:pPr>
-      <w:r>
-        <w:rPr>
-          <w:rFonts w:cstheme="minorHAnsi"/>
-          <w:b/>
-          <w:bCs/>
-          <w:color w:val="000000"/>
-          <w:sz w:val="16"/>
-          <w:szCs w:val="16"/>
-          <w:u w:val="single"/>
-        </w:rPr>
-        <w:t>3.- GARANTÍA</w:t>
-      </w:r>
-    </w:p>
-    <w:p>
-      <w:pPr>
-        <w:spacing w:before="10" w:after="10" w:line="240" w:lineRule="auto"/>
-        <w:ind w:right="-1085"/>
-        <w:jc w:val="both"/>
-        <w:rPr>
-          <w:rFonts w:cstheme="minorHAnsi"/>
-          <w:color w:val="000000"/>
-          <w:sz w:val="16"/>
-          <w:szCs w:val="16"/>
-        </w:rPr>
-      </w:pPr>
-      <w:r>
-        <w:rPr>
-          <w:rFonts w:cstheme="minorHAnsi"/>
-          <w:color w:val="000000"/>
-          <w:sz w:val="16"/>
-          <w:szCs w:val="16"/>
-        </w:rPr>
-        <w:t xml:space="preserve">En respaldo del cumplimiento del pago del préstamo, interés compensatorio fijo, penalidades de ser el caso, comisiones, gastos e impuestos señalados en la Cláusula Primera, así como de cualquier otra obligación frente a </w:t>
-      </w:r>
-      <w:r>
-        <w:rPr>
-          <w:rFonts w:cstheme="minorHAnsi"/>
-          <w:b/>
-          <w:bCs/>
-          <w:color w:val="000000"/>
-          <w:sz w:val="16"/>
-          <w:szCs w:val="16"/>
-        </w:rPr>
-        <w:t>CREDIÁGIL</w:t>
-      </w:r>
-      <w:r>
-        <w:rPr>
-          <w:rFonts w:cstheme="minorHAnsi"/>
-          <w:color w:val="000000"/>
-          <w:sz w:val="16"/>
-          <w:szCs w:val="16"/>
-        </w:rPr>
-        <w:t xml:space="preserve">, presente o futura, se constituye Primera y Preferente Garantía Mobiliaria Vehicular con entrega de posesión y a plazo indeterminado a favor de </w:t>
-      </w:r>
-      <w:r>
-        <w:rPr>
-          <w:rFonts w:cstheme="minorHAnsi"/>
-          <w:b/>
-          <w:bCs/>
-          <w:color w:val="000000"/>
-          <w:sz w:val="16"/>
-          <w:szCs w:val="16"/>
-        </w:rPr>
-        <w:t>CREDIÁGIL</w:t>
-      </w:r>
-      <w:r>
-        <w:rPr>
-          <w:rFonts w:cstheme="minorHAnsi"/>
-          <w:color w:val="000000"/>
-          <w:sz w:val="16"/>
-          <w:szCs w:val="16"/>
-        </w:rPr>
-        <w:t xml:space="preserve"> hasta por la suma de S/ </w:t>
-      </w:r>
-      <w:r>
-        <w:rPr>
-          <w:rFonts w:cstheme="minorHAnsi"/>
-          <w:color w:val="000000"/>
-          <w:sz w:val="16"/>
-          <w:szCs w:val="16"/>
-        </w:rPr>
-        <w:t>${</w:t>
-      </w:r>
-      <w:r>
-        <w:rPr>
-          <w:rFonts w:cstheme="minorHAnsi"/>
-          <w:color w:val="000000"/>
-          <w:sz w:val="16"/>
-          <w:szCs w:val="16"/>
-        </w:rPr>
-        <w:t>MONTO_TASACION</w:t>
-      </w:r>
-      <w:r>
-        <w:rPr>
-          <w:rFonts w:cstheme="minorHAnsi"/>
-          <w:color w:val="000000"/>
-          <w:sz w:val="16"/>
-          <w:szCs w:val="16"/>
-        </w:rPr>
-        <w:t>}</w:t>
-      </w:r>
-      <w:r>
-        <w:rPr>
-          <w:rFonts w:cstheme="minorHAnsi"/>
-          <w:color w:val="000000"/>
-          <w:sz w:val="16"/>
-          <w:szCs w:val="16"/>
-        </w:rPr>
-        <w:t>, otorgada por:</w:t>
-      </w:r>
-    </w:p>
-    <w:p>
-      <w:pPr>
-        <w:spacing w:before="10" w:after="10" w:line="240" w:lineRule="auto"/>
-        <w:ind w:right="-1085"/>
-        <w:jc w:val="both"/>
-        <w:rPr>
-          <w:rFonts w:cstheme="minorHAnsi"/>
-          <w:color w:val="000000"/>
-          <w:sz w:val="16"/>
-          <w:szCs w:val="16"/>
-        </w:rPr>
-      </w:pPr>
-    </w:p>
-    <w:p>
-      <w:pPr>
-        <w:spacing w:before="10" w:after="10" w:line="240" w:lineRule="auto"/>
-        <w:ind w:right="-1085"/>
-        <w:jc w:val="both"/>
-        <w:rPr>
-          <w:rFonts w:cstheme="minorHAnsi"/>
-          <w:color w:val="000000"/>
-          <w:sz w:val="16"/>
-          <w:szCs w:val="16"/>
-        </w:rPr>
-      </w:pPr>
-      <w:r>
-        <w:rPr>
-          <w:rFonts w:cstheme="minorHAnsi"/>
-          <w:color w:val="000000"/>
-          <w:sz w:val="16"/>
-          <w:szCs w:val="16"/>
-        </w:rPr>
-        <w:t xml:space="preserve">a. </w:t>
-      </w:r>
-      <w:r>
-        <w:rPr>
-          <w:rFonts w:cstheme="minorHAnsi"/>
-          <w:b/>
-          <w:bCs/>
-          <w:color w:val="000000"/>
-          <w:sz w:val="16"/>
-          <w:szCs w:val="16"/>
-        </w:rPr>
-        <w:t>EL CLIENTE</w:t>
-      </w:r>
-      <w:r>
-        <w:rPr>
-          <w:rFonts w:cstheme="minorHAnsi"/>
-          <w:color w:val="000000"/>
-          <w:sz w:val="16"/>
-          <w:szCs w:val="16"/>
-        </w:rPr>
-        <w:t>, en su calidad de propietario y titular registral del vehículo, debidamente representado por su apoderado legal; o en su defecto por,</w:t>
-      </w:r>
-    </w:p>
-    <w:p>
-      <w:pPr>
-        <w:spacing w:before="10" w:after="10" w:line="240" w:lineRule="auto"/>
-        <w:ind w:right="-1085"/>
-        <w:jc w:val="both"/>
-        <w:rPr>
-          <w:rFonts w:cstheme="minorHAnsi"/>
-          <w:color w:val="000000"/>
-          <w:sz w:val="16"/>
-          <w:szCs w:val="16"/>
-        </w:rPr>
-      </w:pPr>
-    </w:p>
-    <w:p>
-      <w:pPr>
-        <w:spacing w:before="10" w:after="10" w:line="240" w:lineRule="auto"/>
-        <w:ind w:right="-1085"/>
-        <w:jc w:val="both"/>
-        <w:rPr>
-          <w:rFonts w:cstheme="minorHAnsi"/>
-          <w:color w:val="000000"/>
-          <w:sz w:val="16"/>
-          <w:szCs w:val="16"/>
-        </w:rPr>
-      </w:pPr>
-      <w:r>
-        <w:rPr>
-          <w:rFonts w:cstheme="minorHAnsi"/>
-          <w:color w:val="000000"/>
-          <w:sz w:val="16"/>
-          <w:szCs w:val="16"/>
-        </w:rPr>
-        <w:t xml:space="preserve">b. </w:t>
-      </w:r>
-      <w:r>
-        <w:rPr>
-          <w:rFonts w:cstheme="minorHAnsi"/>
-          <w:b/>
-          <w:bCs/>
-          <w:color w:val="000000"/>
-          <w:sz w:val="16"/>
-          <w:szCs w:val="16"/>
-        </w:rPr>
-        <w:t>EL GARANTE MOBILIARIO:</w:t>
-      </w:r>
-      <w:r>
-        <w:rPr>
-          <w:rFonts w:cstheme="minorHAnsi"/>
-          <w:color w:val="000000"/>
-          <w:sz w:val="16"/>
-          <w:szCs w:val="16"/>
-        </w:rPr>
-        <w:t xml:space="preserve"> El señor(a) </w:t>
-      </w:r>
-      <w:r>
-        <w:rPr>
-          <w:rFonts w:cstheme="minorHAnsi"/>
-          <w:color w:val="000000"/>
-          <w:sz w:val="16"/>
-          <w:szCs w:val="16"/>
-        </w:rPr>
-        <w:t>${</w:t>
-      </w:r>
-      <w:r>
-        <w:rPr>
-          <w:rFonts w:cstheme="minorHAnsi"/>
-          <w:color w:val="000000"/>
-          <w:sz w:val="16"/>
-          <w:szCs w:val="16"/>
-        </w:rPr>
-        <w:t>NOMBRE_GARANTE</w:t>
-      </w:r>
-      <w:r>
-        <w:rPr>
-          <w:rFonts w:cstheme="minorHAnsi"/>
-          <w:color w:val="000000"/>
-          <w:sz w:val="16"/>
-          <w:szCs w:val="16"/>
-        </w:rPr>
-        <w:t>}</w:t>
-      </w:r>
-      <w:r>
-        <w:rPr>
-          <w:rFonts w:cstheme="minorHAnsi"/>
-          <w:color w:val="000000"/>
-          <w:sz w:val="16"/>
-          <w:szCs w:val="16"/>
-        </w:rPr>
-        <w:t xml:space="preserve"> identificado con DNI </w:t>
-      </w:r>
-      <w:proofErr w:type="spellStart"/>
-      <w:r>
-        <w:rPr>
-          <w:rFonts w:cstheme="minorHAnsi"/>
-          <w:color w:val="000000"/>
-          <w:sz w:val="16"/>
-          <w:szCs w:val="16"/>
-        </w:rPr>
-        <w:t>Nº</w:t>
-      </w:r>
-      <w:proofErr w:type="spellEnd"/>
-      <w:r>
-        <w:rPr>
-          <w:rFonts w:cstheme="minorHAnsi"/>
-          <w:color w:val="000000"/>
-          <w:sz w:val="16"/>
-          <w:szCs w:val="16"/>
-        </w:rPr>
-        <w:t xml:space="preserve"> </w:t>
-      </w:r>
-      <w:r>
-        <w:rPr>
-          <w:rFonts w:cstheme="minorHAnsi"/>
-          <w:color w:val="000000"/>
-          <w:sz w:val="16"/>
-          <w:szCs w:val="16"/>
-        </w:rPr>
-        <w:t>${</w:t>
-      </w:r>
-      <w:r>
-        <w:rPr>
-          <w:rFonts w:cstheme="minorHAnsi"/>
-          <w:color w:val="000000"/>
-          <w:sz w:val="16"/>
-          <w:szCs w:val="16"/>
-        </w:rPr>
-        <w:t>DNI_GARANTE</w:t>
-      </w:r>
-      <w:r>
-        <w:rPr>
-          <w:rFonts w:cstheme="minorHAnsi"/>
-          <w:color w:val="000000"/>
-          <w:sz w:val="16"/>
-          <w:szCs w:val="16"/>
-        </w:rPr>
-        <w:t>}</w:t>
-      </w:r>
-      <w:r>
-        <w:rPr>
-          <w:rFonts w:cstheme="minorHAnsi"/>
-          <w:color w:val="000000"/>
-          <w:sz w:val="16"/>
-          <w:szCs w:val="16"/>
-        </w:rPr>
-        <w:t xml:space="preserve">, y su cónyuge </w:t>
-      </w:r>
-      <w:r>
-        <w:rPr>
-          <w:rFonts w:cstheme="minorHAnsi"/>
-          <w:color w:val="000000"/>
-          <w:sz w:val="16"/>
-          <w:szCs w:val="16"/>
-        </w:rPr>
-        <w:t>${</w:t>
-      </w:r>
-      <w:r>
-        <w:rPr>
-          <w:rFonts w:cstheme="minorHAnsi"/>
-          <w:color w:val="000000"/>
-          <w:sz w:val="16"/>
-          <w:szCs w:val="16"/>
-        </w:rPr>
-        <w:t>CONYUGE_GARANTE</w:t>
-      </w:r>
-      <w:r>
-        <w:rPr>
-          <w:rFonts w:cstheme="minorHAnsi"/>
-          <w:color w:val="000000"/>
-          <w:sz w:val="16"/>
-          <w:szCs w:val="16"/>
-        </w:rPr>
-        <w:t>}</w:t>
-      </w:r>
-      <w:r>
-        <w:rPr>
-          <w:rFonts w:cstheme="minorHAnsi"/>
-          <w:color w:val="000000"/>
-          <w:sz w:val="16"/>
-          <w:szCs w:val="16"/>
-        </w:rPr>
-        <w:t xml:space="preserve"> con DNI </w:t>
-      </w:r>
-      <w:proofErr w:type="spellStart"/>
-      <w:r>
-        <w:rPr>
-          <w:rFonts w:cstheme="minorHAnsi"/>
-          <w:color w:val="000000"/>
-          <w:sz w:val="16"/>
-          <w:szCs w:val="16"/>
-        </w:rPr>
-        <w:t>Nº</w:t>
-      </w:r>
-      <w:proofErr w:type="spellEnd"/>
-      <w:r>
-        <w:rPr>
-          <w:rFonts w:cstheme="minorHAnsi"/>
-          <w:color w:val="000000"/>
-          <w:sz w:val="16"/>
-          <w:szCs w:val="16"/>
-        </w:rPr>
-        <w:t xml:space="preserve"> </w:t>
-      </w:r>
-      <w:r>
-        <w:rPr>
-          <w:rFonts w:cstheme="minorHAnsi"/>
-          <w:color w:val="000000"/>
-          <w:sz w:val="16"/>
-          <w:szCs w:val="16"/>
-        </w:rPr>
-        <w:t>${</w:t>
-      </w:r>
-      <w:r>
-        <w:rPr>
-          <w:rFonts w:cstheme="minorHAnsi"/>
-          <w:color w:val="000000"/>
-          <w:sz w:val="16"/>
-          <w:szCs w:val="16"/>
-        </w:rPr>
-        <w:t>DNI_CONYUGE_GARANTE</w:t>
-      </w:r>
-      <w:r>
-        <w:rPr>
-          <w:rFonts w:cstheme="minorHAnsi"/>
-          <w:color w:val="000000"/>
-          <w:sz w:val="16"/>
-          <w:szCs w:val="16"/>
-        </w:rPr>
-        <w:t>}</w:t>
-      </w:r>
-      <w:r>
-        <w:rPr>
-          <w:rFonts w:cstheme="minorHAnsi"/>
-          <w:color w:val="000000"/>
-          <w:sz w:val="16"/>
-          <w:szCs w:val="16"/>
-        </w:rPr>
-        <w:t xml:space="preserve">, con domicilio en </w:t>
-      </w:r>
-      <w:r>
-        <w:rPr>
-          <w:rFonts w:cstheme="minorHAnsi"/>
-          <w:color w:val="000000"/>
-          <w:sz w:val="16"/>
-          <w:szCs w:val="16"/>
-        </w:rPr>
-        <w:t>${</w:t>
-      </w:r>
-      <w:r>
-        <w:rPr>
-          <w:rFonts w:cstheme="minorHAnsi"/>
-          <w:color w:val="000000"/>
-          <w:sz w:val="16"/>
-          <w:szCs w:val="16"/>
-        </w:rPr>
-        <w:t>DOMICILIO_GARANTE</w:t>
-      </w:r>
-      <w:r>
-        <w:rPr>
-          <w:rFonts w:cstheme="minorHAnsi"/>
-          <w:color w:val="000000"/>
-          <w:sz w:val="16"/>
-          <w:szCs w:val="16"/>
-        </w:rPr>
-        <w:t>}</w:t>
-      </w:r>
-      <w:r>
-        <w:rPr>
-          <w:rFonts w:cstheme="minorHAnsi"/>
-          <w:color w:val="000000"/>
-          <w:sz w:val="16"/>
-          <w:szCs w:val="16"/>
-        </w:rPr>
-        <w:t xml:space="preserve">, adquiriendo en consecuencia la calidad de DEUDOR SOLIDARIO de la presente obligación asumida por </w:t>
-      </w:r>
-      <w:r>
-        <w:rPr>
-          <w:rFonts w:cstheme="minorHAnsi"/>
-          <w:b/>
-          <w:bCs/>
-          <w:color w:val="000000"/>
-          <w:sz w:val="16"/>
-          <w:szCs w:val="16"/>
-        </w:rPr>
-        <w:t>EL CLIENTE</w:t>
-      </w:r>
-      <w:r>
-        <w:rPr>
-          <w:rFonts w:cstheme="minorHAnsi"/>
-          <w:color w:val="000000"/>
-          <w:sz w:val="16"/>
-          <w:szCs w:val="16"/>
-        </w:rPr>
-        <w:t>.</w:t>
-      </w:r>
-    </w:p>
-    <w:p>
-      <w:pPr>
-        <w:spacing w:before="10" w:after="10" w:line="240" w:lineRule="auto"/>
-        <w:ind w:right="-1085"/>
-        <w:jc w:val="both"/>
-        <w:rPr>
-          <w:rFonts w:cstheme="minorHAnsi"/>
-          <w:color w:val="000000"/>
-          <w:sz w:val="16"/>
-          <w:szCs w:val="16"/>
-        </w:rPr>
-      </w:pPr>
-    </w:p>
-    <w:p>
-      <w:pPr>
-        <w:spacing w:before="10" w:after="10" w:line="240" w:lineRule="auto"/>
-        <w:ind w:right="-1085"/>
-        <w:jc w:val="both"/>
-        <w:rPr>
-          <w:rFonts w:cstheme="minorHAnsi"/>
-          <w:color w:val="000000"/>
-          <w:sz w:val="16"/>
-          <w:szCs w:val="16"/>
-        </w:rPr>
-      </w:pPr>
-      <w:r>
-        <w:rPr>
-          <w:rFonts w:cstheme="minorHAnsi"/>
-          <w:color w:val="000000"/>
-          <w:sz w:val="16"/>
-          <w:szCs w:val="16"/>
-        </w:rPr>
-        <w:t xml:space="preserve">Sobre el vehículo cuyas características técnicas (Marca, Modelo, Placa, Motor, Serie) se detallan minuciosamente en el ANEXO 01 del presente contrato. El vehículo se encuentra inscrito en la Partida Electrónica </w:t>
-      </w:r>
-      <w:proofErr w:type="spellStart"/>
-      <w:r>
-        <w:rPr>
-          <w:rFonts w:cstheme="minorHAnsi"/>
-          <w:color w:val="000000"/>
-          <w:sz w:val="16"/>
-          <w:szCs w:val="16"/>
-        </w:rPr>
-        <w:t>Nº</w:t>
-      </w:r>
-      <w:proofErr w:type="spellEnd"/>
-      <w:r>
-        <w:rPr>
-          <w:rFonts w:cstheme="minorHAnsi"/>
-          <w:color w:val="000000"/>
-          <w:sz w:val="16"/>
-          <w:szCs w:val="16"/>
-        </w:rPr>
-        <w:t xml:space="preserve"> </w:t>
-      </w:r>
-      <w:r>
-        <w:rPr>
-          <w:rFonts w:cstheme="minorHAnsi"/>
-          <w:color w:val="000000"/>
-          <w:sz w:val="16"/>
-          <w:szCs w:val="16"/>
-        </w:rPr>
-        <w:t>${</w:t>
-      </w:r>
-      <w:r>
-        <w:rPr>
-          <w:rFonts w:cstheme="minorHAnsi"/>
-          <w:color w:val="000000"/>
-          <w:sz w:val="16"/>
-          <w:szCs w:val="16"/>
-        </w:rPr>
-        <w:t>AUTO_PARTIDA</w:t>
-      </w:r>
-      <w:r>
-        <w:rPr>
-          <w:rFonts w:cstheme="minorHAnsi"/>
-          <w:color w:val="000000"/>
-          <w:sz w:val="16"/>
-          <w:szCs w:val="16"/>
-        </w:rPr>
-        <w:t>}</w:t>
-      </w:r>
-      <w:r>
-        <w:rPr>
-          <w:rFonts w:cstheme="minorHAnsi"/>
-          <w:color w:val="000000"/>
-          <w:sz w:val="16"/>
-          <w:szCs w:val="16"/>
-        </w:rPr>
-        <w:t xml:space="preserve"> del Registro de Propiedad Vehicular de la Oficina Registral de </w:t>
-      </w:r>
-      <w:r>
-        <w:rPr>
-          <w:rFonts w:cstheme="minorHAnsi"/>
-          <w:color w:val="000000"/>
-          <w:sz w:val="16"/>
-          <w:szCs w:val="16"/>
-        </w:rPr>
-        <w:t>${</w:t>
-      </w:r>
-      <w:r>
-        <w:rPr>
-          <w:rFonts w:cstheme="minorHAnsi"/>
-          <w:color w:val="000000"/>
-          <w:sz w:val="16"/>
-          <w:szCs w:val="16"/>
-        </w:rPr>
-        <w:t>AUTO_OFICINA_REGISTRAL</w:t>
-      </w:r>
-      <w:r>
-        <w:rPr>
-          <w:rFonts w:cstheme="minorHAnsi"/>
-          <w:color w:val="000000"/>
-          <w:sz w:val="16"/>
-          <w:szCs w:val="16"/>
-        </w:rPr>
-        <w:t>}</w:t>
-      </w:r>
-      <w:r>
-        <w:rPr>
-          <w:rFonts w:cstheme="minorHAnsi"/>
-          <w:color w:val="000000"/>
-          <w:sz w:val="16"/>
-          <w:szCs w:val="16"/>
-        </w:rPr>
-        <w:t xml:space="preserve">. </w:t>
-      </w:r>
-      <w:r>
-        <w:rPr>
-          <w:rFonts w:cstheme="minorHAnsi"/>
-          <w:b/>
-          <w:bCs/>
-          <w:color w:val="000000"/>
-          <w:sz w:val="16"/>
-          <w:szCs w:val="16"/>
-        </w:rPr>
-        <w:t>CREDIÁGIL</w:t>
-      </w:r>
-      <w:r>
-        <w:rPr>
-          <w:rFonts w:cstheme="minorHAnsi"/>
-          <w:color w:val="000000"/>
-          <w:sz w:val="16"/>
-          <w:szCs w:val="16"/>
-        </w:rPr>
-        <w:t xml:space="preserve"> se obliga a mantener en buen estado de conservación el bien otorgado en garantía mobiliaria.</w:t>
-      </w:r>
-    </w:p>
-    <w:p>
-      <w:pPr>
-        <w:spacing w:before="10" w:after="10" w:line="240" w:lineRule="auto"/>
-        <w:ind w:right="-1085"/>
-        <w:jc w:val="both"/>
-        <w:rPr>
-          <w:rFonts w:cstheme="minorHAnsi"/>
-          <w:color w:val="000000"/>
-          <w:sz w:val="16"/>
-          <w:szCs w:val="16"/>
-        </w:rPr>
-      </w:pPr>
-    </w:p>
-    <w:p>
-      <w:pPr>
-        <w:spacing w:before="10" w:after="10" w:line="240" w:lineRule="auto"/>
-        <w:ind w:right="-1085"/>
-        <w:jc w:val="both"/>
-        <w:rPr>
-          <w:rFonts w:cstheme="minorHAnsi"/>
-          <w:color w:val="000000"/>
-          <w:sz w:val="16"/>
-          <w:szCs w:val="16"/>
-          <w:u w:val="single"/>
-        </w:rPr>
-      </w:pPr>
-    </w:p>
-    <w:p>
-      <w:pPr>
-        <w:spacing w:before="10" w:after="10" w:line="240" w:lineRule="auto"/>
-        <w:ind w:right="-1085"/>
-        <w:jc w:val="both"/>
-        <w:rPr>
-          <w:rFonts w:cstheme="minorHAnsi"/>
-          <w:color w:val="000000"/>
-          <w:sz w:val="16"/>
-          <w:szCs w:val="16"/>
-        </w:rPr>
-      </w:pPr>
-    </w:p>
-    <w:p>
-      <w:pPr>
-        <w:spacing w:before="10" w:after="10" w:line="240" w:lineRule="auto"/>
-        <w:ind w:right="-1085"/>
-        <w:jc w:val="both"/>
-        <w:rPr>
-          <w:rFonts w:cstheme="minorHAnsi"/>
-          <w:color w:val="000000"/>
-          <w:sz w:val="16"/>
-          <w:szCs w:val="16"/>
-        </w:rPr>
-      </w:pPr>
-    </w:p>
-    <w:p>
-      <w:pPr>
-        <w:spacing w:before="10" w:after="10" w:line="240" w:lineRule="auto"/>
-        <w:ind w:right="-1085"/>
-        <w:jc w:val="both"/>
-        <w:rPr>
-          <w:rFonts w:cstheme="minorHAnsi"/>
-          <w:b/>
-          <w:color w:val="000000"/>
-          <w:sz w:val="16"/>
-          <w:szCs w:val="16"/>
-          <w:u w:val="single"/>
-        </w:rPr>
-      </w:pPr>
-      <w:r>
-        <w:rPr>
-          <w:rFonts w:cstheme="minorHAnsi"/>
-          <w:b/>
-          <w:color w:val="000000"/>
-          <w:sz w:val="16"/>
-          <w:szCs w:val="16"/>
-          <w:u w:val="single"/>
-        </w:rPr>
-        <w:lastRenderedPageBreak/>
         <w:t>4.- VALORIZACIÓN</w:t>
       </w:r>
     </w:p>
@@ -8751,81 +8588,14 @@
           <w:szCs w:val="16"/>
         </w:rPr>
       </w:pPr>
-    </w:p>
-    <w:p>
-      <w:pPr>
-        <w:spacing w:before="10" w:after="10" w:line="240" w:lineRule="auto"/>
-        <w:ind w:right="-1085"/>
-        <w:jc w:val="both"/>
-        <w:rPr>
-          <w:rFonts w:cstheme="minorHAnsi"/>
-          <w:color w:val="000000"/>
-          <w:sz w:val="16"/>
-          <w:szCs w:val="16"/>
-        </w:rPr>
-      </w:pPr>
-      <w:r>
-        <w:rPr>
-          <w:rFonts w:cstheme="minorHAnsi"/>
-          <w:color w:val="000000"/>
-          <w:sz w:val="16"/>
-          <w:szCs w:val="16"/>
-        </w:rPr>
-        <w:t>_______________________________________________________</w:t>
-      </w:r>
-      <w:r>
-        <w:rPr>
-          <w:rFonts w:cstheme="minorHAnsi"/>
-          <w:color w:val="000000"/>
-          <w:sz w:val="16"/>
-          <w:szCs w:val="16"/>
-        </w:rPr>
-        <w:t>_</w:t>
-      </w:r>
-      <w:r>
-        <w:rPr>
-          <w:rFonts w:cstheme="minorHAnsi"/>
-          <w:color w:val="000000"/>
-          <w:sz w:val="16"/>
-          <w:szCs w:val="16"/>
-        </w:rPr>
-        <w:t>_</w:t>
-      </w:r>
-      <w:r>
-        <w:rPr>
-          <w:rFonts w:cstheme="minorHAnsi"/>
-          <w:color w:val="000000"/>
-          <w:sz w:val="16"/>
-          <w:szCs w:val="16"/>
-        </w:rPr>
-        <w:t>______</w:t>
-      </w:r>
-      <w:r>
-        <w:rPr>
-          <w:rFonts w:cstheme="minorHAnsi"/>
-          <w:color w:val="000000"/>
-          <w:sz w:val="16"/>
-          <w:szCs w:val="16"/>
-        </w:rPr>
-        <w:t xml:space="preserve">            </w:t>
-      </w:r>
-      <w:r>
-        <w:rPr>
-          <w:rFonts w:cstheme="minorHAnsi"/>
-          <w:color w:val="000000"/>
-          <w:sz w:val="16"/>
-          <w:szCs w:val="16"/>
-        </w:rPr>
-        <w:t xml:space="preserve">   </w:t>
-      </w:r>
-      <w:r>
-        <w:rPr>
-          <w:rFonts w:cstheme="minorHAnsi"/>
-          <w:color w:val="000000"/>
-          <w:sz w:val="16"/>
-          <w:szCs w:val="16"/>
-        </w:rPr>
-        <w:t>________________________________________________________________</w:t>
+      <w:r>
+        <w:rPr>
+          <w:rFonts w:cstheme="minorHAnsi"/>
+          <w:color w:val="000000"/>
+          <w:sz w:val="16"/>
+          <w:szCs w:val="16"/>
+        </w:rPr>
+        <w:t>_______________________________________________________________               ________________________________________________________________</w:t>
       </w:r>
     </w:p>
     <w:p>
@@ -9020,16 +8790,7 @@
           <w:sz w:val="18"/>
           <w:szCs w:val="20"/>
         </w:rPr>
-        <w:t xml:space="preserve">    CREDIÁGIL                                                                                                      </w:t>
-      </w:r>
-      <w:r>
-        <w:rPr>
-          <w:rFonts w:cstheme="minorHAnsi"/>
-          <w:color w:val="000000"/>
-          <w:sz w:val="18"/>
-          <w:szCs w:val="20"/>
-        </w:rPr>
-        <w:t xml:space="preserve">                </w:t>
+        <w:t xml:space="preserve">    CREDIÁGIL                                                                                                                      </w:t>
       </w:r>
       <w:r>
         <w:rPr>
@@ -9153,7 +8914,7 @@
           <w:sz w:val="18"/>
           <w:szCs w:val="20"/>
         </w:rPr>
-        <w:t xml:space="preserve">                                              </w:t>
+        <w:t xml:space="preserve">                                                    </w:t>
       </w:r>
       <w:r>
         <w:rPr>
@@ -9162,7 +8923,7 @@
           <w:sz w:val="18"/>
           <w:szCs w:val="20"/>
         </w:rPr>
-        <w:t xml:space="preserve">      </w:t>
+        <w:t xml:space="preserve">NOMBRE: </w:t>
       </w:r>
       <w:r>
         <w:rPr>
@@ -9171,7 +8932,7 @@
           <w:sz w:val="18"/>
           <w:szCs w:val="20"/>
         </w:rPr>
-        <w:t xml:space="preserve">NOMBRE: </w:t>
+        <w:t>${</w:t>
       </w:r>
       <w:r>
         <w:rPr>
@@ -9180,7 +8941,7 @@
           <w:sz w:val="18"/>
           <w:szCs w:val="20"/>
         </w:rPr>
-        <w:t>${</w:t>
+        <w:t>NOMBRE_CLIENTE</w:t>
       </w:r>
       <w:r>
         <w:rPr>
@@ -9189,8 +8950,20 @@
           <w:sz w:val="18"/>
           <w:szCs w:val="20"/>
         </w:rPr>
-        <w:t>NOMBRE_CLIENTE</w:t>
-      </w:r>
+        <w:t>}</w:t>
+      </w:r>
+    </w:p>
+    <w:p>
+      <w:pPr>
+        <w:spacing w:before="10" w:after="10" w:line="240" w:lineRule="auto"/>
+        <w:ind w:left="-142" w:right="-1085"/>
+        <w:jc w:val="both"/>
+        <w:rPr>
+          <w:rFonts w:cstheme="minorHAnsi"/>
+          <w:sz w:val="20"/>
+          <w:szCs w:val="19"/>
+        </w:rPr>
+      </w:pPr>
       <w:r>
         <w:rPr>
           <w:rFonts w:cstheme="minorHAnsi"/>
@@ -9198,20 +8971,8 @@
           <w:sz w:val="18"/>
           <w:szCs w:val="20"/>
         </w:rPr>
-        <w:t>}</w:t>
-      </w:r>
-    </w:p>
-    <w:p>
-      <w:pPr>
-        <w:spacing w:before="10" w:after="10" w:line="240" w:lineRule="auto"/>
-        <w:ind w:left="-142" w:right="-1085"/>
-        <w:jc w:val="both"/>
-        <w:rPr>
-          <w:rFonts w:cstheme="minorHAnsi"/>
-          <w:sz w:val="20"/>
-          <w:szCs w:val="19"/>
-        </w:rPr>
-      </w:pPr>
+        <w:t xml:space="preserve">    </w:t>
+      </w:r>
       <w:r>
         <w:rPr>
           <w:rFonts w:cstheme="minorHAnsi"/>
@@ -9219,7 +8980,7 @@
           <w:sz w:val="18"/>
           <w:szCs w:val="20"/>
         </w:rPr>
-        <w:t xml:space="preserve">    </w:t>
+        <w:t>DNI:</w:t>
       </w:r>
       <w:r>
         <w:rPr>
@@ -9228,7 +8989,7 @@
           <w:sz w:val="18"/>
           <w:szCs w:val="20"/>
         </w:rPr>
-        <w:t>DNI:</w:t>
+        <w:t xml:space="preserve"> ${</w:t>
       </w:r>
       <w:r>
         <w:rPr>
@@ -9237,8 +8998,9 @@
           <w:sz w:val="18"/>
           <w:szCs w:val="20"/>
         </w:rPr>
-        <w:t xml:space="preserve"> ${</w:t>
-      </w:r>
+        <w:t>DNI_APODERADO_</w:t>
+      </w:r>
+      <w:proofErr w:type="gramStart"/>
       <w:r>
         <w:rPr>
           <w:rFonts w:cstheme="minorHAnsi"/>
@@ -9246,9 +9008,8 @@
           <w:sz w:val="18"/>
           <w:szCs w:val="20"/>
         </w:rPr>
-        <w:t>DNI_APODERADO_</w:t>
-      </w:r>
-      <w:proofErr w:type="gramStart"/>
+        <w:t>CA</w:t>
+      </w:r>
       <w:r>
         <w:rPr>
           <w:rFonts w:cstheme="minorHAnsi"/>
@@ -9256,7 +9017,7 @@
           <w:sz w:val="18"/>
           <w:szCs w:val="20"/>
         </w:rPr>
-        <w:t>CA</w:t>
+        <w:t>}</w:t>
       </w:r>
       <w:r>
         <w:rPr>
@@ -9265,7 +9026,7 @@
           <w:sz w:val="18"/>
           <w:szCs w:val="20"/>
         </w:rPr>
-        <w:t>}</w:t>
+        <w:t xml:space="preserve">  </w:t>
       </w:r>
       <w:r>
         <w:rPr>
@@ -9274,8 +9035,9 @@
           <w:sz w:val="18"/>
           <w:szCs w:val="20"/>
         </w:rPr>
-        <w:t xml:space="preserve">  </w:t>
-      </w:r>
+        <w:t xml:space="preserve"> </w:t>
+      </w:r>
+      <w:proofErr w:type="gramEnd"/>
       <w:r>
         <w:rPr>
           <w:rFonts w:cstheme="minorHAnsi"/>
@@ -9283,44 +9045,7 @@
           <w:sz w:val="18"/>
           <w:szCs w:val="20"/>
         </w:rPr>
-        <w:t xml:space="preserve"> </w:t>
-      </w:r>
-      <w:proofErr w:type="gramEnd"/>
-      <w:r>
-        <w:rPr>
-          <w:rFonts w:cstheme="minorHAnsi"/>
-          <w:color w:val="000000"/>
-          <w:sz w:val="18"/>
-          <w:szCs w:val="20"/>
-        </w:rPr>
-        <w:t xml:space="preserve">                                                                </w:t>
-      </w:r>
-      <w:r>
-        <w:rPr>
-          <w:rFonts w:cstheme="minorHAnsi"/>
-          <w:color w:val="000000"/>
-          <w:sz w:val="18"/>
-          <w:szCs w:val="20"/>
-        </w:rPr>
-        <w:t xml:space="preserve">     </w:t>
-      </w:r>
-      <w:r>
-        <w:rPr>
-          <w:rFonts w:cstheme="minorHAnsi"/>
-          <w:color w:val="000000"/>
-          <w:sz w:val="18"/>
-          <w:szCs w:val="20"/>
-        </w:rPr>
-        <w:t xml:space="preserve">  </w:t>
-      </w:r>
-      <w:r>
-        <w:rPr>
-          <w:rFonts w:cstheme="minorHAnsi"/>
-          <w:color w:val="000000"/>
-          <w:sz w:val="18"/>
-          <w:szCs w:val="20"/>
-        </w:rPr>
-        <w:t xml:space="preserve">    </w:t>
+        <w:t xml:space="preserve">                                                                           </w:t>
       </w:r>
       <w:r>
         <w:rPr>
@@ -9827,7 +9552,7 @@
               <wp:extent cx="298450" cy="298450"/>
               <wp:effectExtent l="0" t="0" r="0" b="0"/>
               <wp:wrapNone/>
-              <wp:docPr id="2" name="Group 2"/>
+              <wp:docPr id="3" name="Group 2"/>
               <wp:cNvGraphicFramePr>
                 <a:graphicFrameLocks xmlns:a="http://schemas.openxmlformats.org/drawingml/2006/main"/>
               </wp:cNvGraphicFramePr>
@@ -9846,7 +9571,7 @@
                       </a:xfrm>
                     </wpg:grpSpPr>
                     <wps:wsp>
-                      <wps:cNvPr id="3" name="Graphic 3"/>
+                      <wps:cNvPr id="4" name="Graphic 3"/>
                       <wps:cNvSpPr/>
                       <wps:spPr>
                         <a:xfrm>
@@ -9941,7 +9666,7 @@
                     </wps:wsp>
                     <pic:pic xmlns:pic="http://schemas.openxmlformats.org/drawingml/2006/picture">
                       <pic:nvPicPr>
-                        <pic:cNvPr id="4" name="Image 4"/>
+                        <pic:cNvPr id="11" name="Image 4"/>
                         <pic:cNvPicPr/>
                       </pic:nvPicPr>
                       <pic:blipFill>
@@ -10107,7 +9832,7 @@
               <wp:extent cx="1506855" cy="139700"/>
               <wp:effectExtent l="0" t="0" r="0" b="0"/>
               <wp:wrapNone/>
-              <wp:docPr id="11" name="Textbox 11"/>
+              <wp:docPr id="13" name="Textbox 11"/>
               <wp:cNvGraphicFramePr>
                 <a:graphicFrameLocks xmlns:a="http://schemas.openxmlformats.org/drawingml/2006/main"/>
               </wp:cNvGraphicFramePr>
@@ -10203,7 +9928,7 @@
               <wp:extent cx="806450" cy="139700"/>
               <wp:effectExtent l="0" t="0" r="0" b="0"/>
               <wp:wrapNone/>
-              <wp:docPr id="13" name="Textbox 13"/>
+              <wp:docPr id="26" name="Textbox 13"/>
               <wp:cNvGraphicFramePr>
                 <a:graphicFrameLocks xmlns:a="http://schemas.openxmlformats.org/drawingml/2006/main"/>
               </wp:cNvGraphicFramePr>
@@ -10387,7 +10112,7 @@
               <wp:extent cx="7772400" cy="226337"/>
               <wp:effectExtent l="0" t="0" r="0" b="2540"/>
               <wp:wrapNone/>
-              <wp:docPr id="1" name="Graphic 1"/>
+              <wp:docPr id="29" name="Graphic 1"/>
               <wp:cNvGraphicFramePr>
                 <a:graphicFrameLocks xmlns:a="http://schemas.openxmlformats.org/drawingml/2006/main"/>
               </wp:cNvGraphicFramePr>
@@ -10562,7 +10287,7 @@
                             </a:xfrm>
                           </wpg:grpSpPr>
                           <wps:wsp>
-                            <wps:cNvPr id="15" name="Graphic 15"/>
+                            <wps:cNvPr id="1" name="Graphic 15"/>
                             <wps:cNvSpPr/>
                             <wps:spPr>
                               <a:xfrm>
@@ -11296,7 +11021,7 @@
                       </wps:wsp>
                     </wpg:grpSp>
                     <wps:wsp>
-                      <wps:cNvPr id="14" name="Cuadro de texto 14"/>
+                      <wps:cNvPr id="2" name="Cuadro de texto 14"/>
                       <wps:cNvSpPr txBox="1"/>
                       <wps:spPr>
                         <a:xfrm>
@@ -11396,11 +11121,11 @@
         </mc:Choice>
         <mc:Fallback>
           <w:pict>
-            <v:group w14:anchorId="6E0C7674" id="Grupo 23" o:spid="_x0000_s1026" style="position:absolute;margin-left:544.05pt;margin-top:-99.2pt;width:595.25pt;height:107.65pt;z-index:251671552;mso-position-horizontal:right;mso-position-horizontal-relative:page;mso-width-relative:margin;mso-height-relative:margin" coordsize="75497,13754" o:gfxdata="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">
+            <v:group w14:anchorId="6E0C7674" id="Grupo 23" o:spid="_x0000_s1026" style="position:absolute;margin-left:544.05pt;margin-top:-99.2pt;width:595.25pt;height:107.65pt;z-index:251671552;mso-position-horizontal:right;mso-position-horizontal-relative:page;mso-width-relative:margin;mso-height-relative:margin" coordsize="75497,13754" o:gfxdata="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">
               <v:group id="Grupo 28" o:spid="_x0000_s1027" style="position:absolute;width:75497;height:13754" coordsize="75603,13353" o:gfxdata="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">
                 <v:group id="Grupo 25" o:spid="_x0000_s1028" style="position:absolute;width:75603;height:13353" coordsize="75603,13353" o:gfxdata="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">
                   <v:group id="Grupo 22" o:spid="_x0000_s1029" style="position:absolute;width:75603;height:13353" coordsize="75603,13353" o:gfxdata="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">
-                    <v:shape id="Graphic 15" o:spid="_x0000_s1030" style="position:absolute;width:75603;height:10287;visibility:visible;mso-wrap-style:square;v-text-anchor:top" coordsize="7560309,1028700" o:gfxdata="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" path="m7560005,l,,,1028496r7560005,l7560005,xe" fillcolor="#f5812a" stroked="f">
+                    <v:shape id="Graphic 15" o:spid="_x0000_s1030" style="position:absolute;width:75603;height:10287;visibility:visible;mso-wrap-style:square;v-text-anchor:top" coordsize="7560309,1028700" o:gfxdata="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" path="m7560005,l,,,1028496r7560005,l7560005,xe" fillcolor="#f5812a" stroked="f">
                       <v:path arrowok="t"/>
                     </v:shape>
                     <v:shapetype id="_x0000_t75" coordsize="21600,21600" o:spt="75" o:preferrelative="t" path="m@4@5l@4@11@9@11@9@5xe" filled="f" stroked="f">
@@ -11687,7 +11412,7 @@
                   </v:textbox>
                 </v:shape>
               </v:group>
-              <v:shape id="Cuadro de texto 14" o:spid="_x0000_s1039" type="#_x0000_t202" style="position:absolute;left:6501;top:9685;width:11272;height:2194;visibility:visible;mso-wrap-style:square;v-text-anchor:top" o:gfxdata="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" filled="f" stroked="f" strokeweight=".5pt">
+              <v:shape id="Cuadro de texto 14" o:spid="_x0000_s1039" type="#_x0000_t202" style="position:absolute;left:6501;top:9685;width:11272;height:2194;visibility:visible;mso-wrap-style:square;v-text-anchor:top" o:gfxdata="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" filled="f" stroked="f" strokeweight=".5pt">
                 <v:textbox>
                   <w:txbxContent>
                     <w:p>
@@ -12827,7 +12552,6 @@
   <w:style w:type="character" w:default="1" w:styleId="Fuentedeprrafopredeter">
     <w:name w:val="Default Paragraph Font"/>
     <w:uiPriority w:val="1"/>
-    <w:semiHidden/>
     <w:unhideWhenUsed/>
   </w:style>
   <w:style w:type="table" w:default="1" w:styleId="Tablanormal">

</xml_diff>

<commit_message>
vamos a cerrar el papoi
</commit_message>
<xml_diff>
--- a/CrediAgil/Templates/CONTRATO - PRENDA AUTO - EMPRESA.docx
+++ b/CrediAgil/Templates/CONTRATO - PRENDA AUTO - EMPRESA.docx
@@ -392,6 +392,66 @@
           <w:sz w:val="16"/>
           <w:szCs w:val="16"/>
         </w:rPr>
+        <w:t xml:space="preserve">, con teléfono </w:t>
+      </w:r>
+      <w:proofErr w:type="spellStart"/>
+      <w:r>
+        <w:rPr>
+          <w:rFonts w:cstheme="minorHAnsi"/>
+          <w:color w:val="000000"/>
+          <w:sz w:val="16"/>
+          <w:szCs w:val="16"/>
+        </w:rPr>
+        <w:t>N°</w:t>
+      </w:r>
+      <w:proofErr w:type="spellEnd"/>
+      <w:r>
+        <w:rPr>
+          <w:rFonts w:cstheme="minorHAnsi"/>
+          <w:color w:val="000000"/>
+          <w:sz w:val="16"/>
+          <w:szCs w:val="16"/>
+        </w:rPr>
+        <w:t xml:space="preserve"> </w:t>
+      </w:r>
+      <w:r>
+        <w:rPr>
+          <w:rFonts w:cstheme="minorHAnsi"/>
+          <w:b/>
+          <w:bCs/>
+          <w:color w:val="000000"/>
+          <w:sz w:val="16"/>
+          <w:szCs w:val="16"/>
+        </w:rPr>
+        <w:t>${TEL_EMPRESA}</w:t>
+      </w:r>
+      <w:r>
+        <w:rPr>
+          <w:rFonts w:cstheme="minorHAnsi"/>
+          <w:color w:val="000000"/>
+          <w:sz w:val="16"/>
+          <w:szCs w:val="16"/>
+        </w:rPr>
+        <w:t xml:space="preserve"> y correo electrónico </w:t>
+      </w:r>
+      <w:r>
+        <w:rPr>
+          <w:rFonts w:cstheme="minorHAnsi"/>
+          <w:b/>
+          <w:bCs/>
+          <w:color w:val="000000"/>
+          <w:sz w:val="16"/>
+          <w:szCs w:val="16"/>
+        </w:rPr>
+        <w:t>${EMAIL_EMPRESA}</w:t>
+      </w:r>
+      <w:r>
+        <w:rPr>
+          <w:rFonts w:cstheme="minorHAnsi"/>
+          <w:color w:val="000000"/>
+          <w:sz w:val="16"/>
+          <w:szCs w:val="16"/>
+        </w:rPr>
         <w:t xml:space="preserve">, debidamente representada por el (la) señor(a) </w:t>
       </w:r>
       <w:r>
@@ -504,6 +564,66 @@
           <w:szCs w:val="16"/>
         </w:rPr>
         <w:t>${DEPARTAMENTO_REP_LEGAL}</w:t>
+      </w:r>
+      <w:r>
+        <w:rPr>
+          <w:rFonts w:cstheme="minorHAnsi"/>
+          <w:color w:val="000000"/>
+          <w:sz w:val="16"/>
+          <w:szCs w:val="16"/>
+        </w:rPr>
+        <w:t xml:space="preserve">, con teléfono </w:t>
+      </w:r>
+      <w:proofErr w:type="spellStart"/>
+      <w:r>
+        <w:rPr>
+          <w:rFonts w:cstheme="minorHAnsi"/>
+          <w:color w:val="000000"/>
+          <w:sz w:val="16"/>
+          <w:szCs w:val="16"/>
+        </w:rPr>
+        <w:t>N°</w:t>
+      </w:r>
+      <w:proofErr w:type="spellEnd"/>
+      <w:r>
+        <w:rPr>
+          <w:rFonts w:cstheme="minorHAnsi"/>
+          <w:color w:val="000000"/>
+          <w:sz w:val="16"/>
+          <w:szCs w:val="16"/>
+        </w:rPr>
+        <w:t xml:space="preserve"> </w:t>
+      </w:r>
+      <w:r>
+        <w:rPr>
+          <w:rFonts w:cstheme="minorHAnsi"/>
+          <w:b/>
+          <w:bCs/>
+          <w:color w:val="000000"/>
+          <w:sz w:val="16"/>
+          <w:szCs w:val="16"/>
+        </w:rPr>
+        <w:t>${TEL_REP_LEGAL}</w:t>
+      </w:r>
+      <w:r>
+        <w:rPr>
+          <w:rFonts w:cstheme="minorHAnsi"/>
+          <w:color w:val="000000"/>
+          <w:sz w:val="16"/>
+          <w:szCs w:val="16"/>
+        </w:rPr>
+        <w:t xml:space="preserve"> y correo electrónico </w:t>
+      </w:r>
+      <w:r>
+        <w:rPr>
+          <w:rFonts w:cstheme="minorHAnsi"/>
+          <w:b/>
+          <w:bCs/>
+          <w:color w:val="000000"/>
+          <w:sz w:val="16"/>
+          <w:szCs w:val="16"/>
+        </w:rPr>
+        <w:t>${EMAIL_REP_LEGAL}</w:t>
       </w:r>
       <w:r>
         <w:rPr>

</xml_diff>